<commit_message>
Add replicate MD campaign infra, MM-GBSA scripts, and manuscript updates
Adds the r2/r3 replicate supervisor and status tooling, MM-GBSA recompute
scripts, GLA carboxylate solvent-exposure diagnostic, pi-interaction
rendering, and results from replicate runs completed so far (headline r2
batch, epa/gla r3, plus leftover epa_deprot/gla_ester r2 from an earlier
queue ordering). Broadens the checkpoint gitignore pattern and excludes
the full trajectory bundle (deposited on Zenodo instead). Rolling
progress/supervisor logs intentionally left uncommitted.

Co-Authored-By: Claude Sonnet 5 <noreply@anthropic.com>
</commit_message>
<xml_diff>
--- a/ToxT_docking_manuscript.docx
+++ b/ToxT_docking_manuscript.docx
@@ -14,7 +14,7 @@
           <w:sz w:val="30"/>
           <w:szCs w:val="30"/>
         </w:rPr>
-        <w:t xml:space="preserve">Molecular docking of Chlorella (CV) and Chlorococcum (CCM) lipids against the Vibrio cholerae virulence regulator ToxT</w:t>
+        <w:t xml:space="preserve">Molecular docking and dynamics reveal microalgal lipids from Chlorella variabilis and Chlorococcum sp. as allosteric ligands of the Vibrio cholerae virulence regulator ToxT</w:t>
       </w:r>
     </w:p>
     <w:p>
@@ -46,7 +46,7 @@
         <w:jc w:val="both"/>
       </w:pPr>
       <w:r>
-        <w:t xml:space="preserve">The transcriptional activator ToxT is the master regulator of virulence-gene expression in Vibrio cholerae, and its activity is directly modulated by fatty acids that occupy a hydrophobic binding pocket (Lowden et al., 2010). To test whether direct ToxT binding could underlie the observed antivirulence activity of lipid extracts from two green microalgae (CV and CCM), we docked the lipid species identified in each extract against the ToxT crystal structure (PDB 3GBG). A panel of 22 unique lipids (15 CV, 13 CCM, 6 shared) was docked with AutoDock Vina 1.2.7 into the experimentally defined fatty-acid pocket. The protocol was validated by redocking the co-crystallized fatty acid (palmitoleate), reproducing the crystallographic pose to 1.41 A RMSD; blind docking over the whole protein independently recovered the native site (0.6 A) and identified the fatty-acid pocket as the preferred binding site, with no competing site elsewhere. All lipids bound with moderate-to-strong predicted affinities (-6.8 to -8.8 kcal/mol). Binding strength correlated most strongly with degree of unsaturation (r = -0.87) and chain length (r = -0.70), whereas headgroup esterification state had a negligible effect (mean |dG| ~ 0.11 kcal/mol between free-acid and methyl-ester forms). Rankings were robust to scoring-function choice (Vina vs. Vinardo, Spearman rho = 0.83). Per-molecule affinities were statistically indistinguishable between organisms (mean dG: CV -7.77, CCM -7.64 kcal/mol), indicating that the superior in vivo activity of CCM is not explained by individual-lipid binding strength alone but more likely by abundance-weighted extract composition and bioavailability. Molecular-dynamics simulations (nine 50 ns runs: three fatty acids - EPA, gamma-linolenic and palmitic - each as free acid, methyl ester and deprotonated carboxylate) confirmed every complex is dynamically stable, with the ligand bound to the ToxT pocket for 100% of the trajectory; binding was robust to chain length, esterification and protonation state. Control simulations established specificity: the native ligand remained bound (positive control) while a glucose decoy was expelled to the pocket mouth (negative control), and all cognate lipids - including the weakest binders - formed stable complexes. A modelled ToxT-DNA complex (AlphaFold3) placed the DNA at the C-terminal HTH domain ~30 A from the fatty-acid pocket, indicating an allosteric rather than steric mechanism of transcriptional inhibition.</w:t>
+        <w:t xml:space="preserve">The transcriptional activator ToxT is the master regulator of virulence-gene expression in Vibrio cholerae, and its activity is directly modulated by fatty acids that occupy a hydrophobic binding pocket (Lowden et al., 2010). We previously reported that lipid extracts of the microalgae Chlorella variabilis (CV) and Chlorococcum sp. (CCM) suppress cholera-toxin production by a multidrug-resistant V. cholerae strain by up to 97.9% without affecting bacterial viability (a true antivirulence effect), yet the molecular target was unknown (Jaiswal et al., 2025). To test whether direct ToxT binding could underlie this activity, we docked the lipid species identified in each extract against the ToxT crystal structure (PDB 3GBG). A panel of 22 unique lipids (15 CV, 13 CCM, 6 shared) was docked with AutoDock Vina 1.2.7 into the experimentally defined fatty-acid pocket. The protocol was validated by redocking the co-crystallized fatty acid (palmitoleate), reproducing the crystallographic pose to 1.41 A RMSD; blind docking over the whole protein independently recovered the native site (0.6 A) and identified the fatty-acid pocket as the preferred binding site, with no competing site elsewhere. All lipids bound within a narrow moderate-to-strong range (-6.8 to -8.8 kcal/mol; a ~2 kcal/mol spread within Vina's scoring uncertainty, so per-lipid rankings are trends). Binding strength correlated most strongly with degree of unsaturation (r = -0.87) and chain length (r = -0.70; these descriptors are collinear), whereas headgroup esterification state had a negligible effect (mean |dG| ~ 0.11 kcal/mol). Rankings were robust to scoring-function choice (Vina vs. Vinardo, Spearman rho = 0.83). Docked under an identical protocol, the algal lipids bound comparably to the native ligand and far more strongly than the short-chain fatty acid butyrate, though below the engineered inhibitor virstatin. Per-molecule affinities were indistinguishable between organisms (mean dG: CV -7.77, CCM -7.64 kcal/mol), suggesting any organism-level activity difference reflects extract composition and bioavailability rather than per-lipid binding strength - a hypothesis not tested here. Molecular-dynamics simulations (nine 50 ns runs: three fatty acids - EPA, gamma-linolenic and palmitic - each as free acid, methyl ester and deprotonated carboxylate) showed every complex to be dynamically stable, with the ligand retained in the ToxT pocket throughout; binding was robust to chain length, esterification and protonation state. Specificity was established chiefly by binding preference: in whole-protein blind docking the glucose decoy never localised to the fatty-acid pocket (0/20 poses; best pose 17 A away) and bound weakly (-5.5 kcal/mol), whereas the fatty acids strongly selected it (8-15/15 poses). In MD the native ligand was retained; the decoy was retained only when artificially seeded in the pocket core, reflecting kinetic trapping in a buried cavity - underscoring that binding preference, not MD retention, discriminates cognate lipids from the decoy. MM-GBSA independently gave glucose the least favourable energy. A modelled ToxT-DNA complex (AlphaFold3; confident fold, low-confidence DNA interface) placed the DNA on the C-terminal helix-turn-helix domain, distinct from the N-terminal fatty-acid pocket, suggesting an allosteric rather than steric basis for inhibition.</w:t>
       </w:r>
     </w:p>
     <w:p>
@@ -72,7 +72,7 @@
         <w:jc w:val="both"/>
       </w:pPr>
       <w:r>
-        <w:t xml:space="preserve">Natural-product inhibitors exploiting this mechanism are of interest as antivirulence agents. Lipid extracts of two green microalgae (CV and CCM) reduce V. cholerae virulence phenotypes; because both extracts are rich in free fatty acids and fatty-acid methyl esters, we hypothesized that their activity is mediated, at least in part, by direct binding to the ToxT fatty-acid pocket. Here we use molecular docking to (i) test whether the lipid species detected in each extract are predicted to bind ToxT, (ii) identify the structural determinants of binding, (iii) ask whether the free-acid or methyl-ester form is favored, and (iv) compare the two organisms.</w:t>
+        <w:t xml:space="preserve">Natural-product inhibitors exploiting this mechanism are of interest as antivirulence agents. ToxT has previously been targeted computationally with synthetic/screened inhibitors (virstatin, toxtazins, fatty-acid mimetics) and individual natural compounds (herbal polyphenols; short-chain fatty acids such as butyrate); however, the lipid profiles of specific antivirulence-active microalgae have not been characterised against it. In previous work (Jaiswal et al., 2025) we reported that lipid extracts and crude biomass of Chlorella variabilis (CV) and Chlorococcum sp. (CCM) suppress cholera-toxin (CT) production by a multidrug-resistant V. cholerae strain - up to 97.9% inhibition (CCM lipid extract) in vitro and reduced fluid accumulation/CT in a rabbit ileal-loop model in vivo - without affecting bacterial viability, the hallmark of a true antivirulence effect. However, the molecular target was not identified. Because CT is transcriptionally activated by ToxT, and both extracts are rich in fatty acids and methyl esters resembling ToxT's natural ligands, we hypothesised the lipids act by binding the ToxT fatty-acid pocket, supplying a mechanism for the observed antivirulence activity. Here we combine docking (per-organism panels; native-ligand and blind-docking validation; consensus scoring; benchmarking against known inhibitors), all-atom MD with controls, single-trajectory MM-GBSA, and an AlphaFold3 ToxT-DNA model to (i) test whether the detected lipids engage ToxT, (ii) define structural determinants, (iii) resolve the bound form and protonation state, (iv) establish specificity, and (v) propose a structural mechanism linking pocket occupancy to transcriptional inhibition.</w:t>
       </w:r>
     </w:p>
     <w:p>
@@ -3018,7 +3018,976 @@
         <w:jc w:val="both"/>
       </w:pPr>
       <w:r>
-        <w:t xml:space="preserve">Across all 22 lipids, affinity correlated most strongly with the number of C=C double bonds (r = -0.87) and chain length (r = -0.70). Lipophilicity, polarity, and flexibility were weak or non-predictive (Table 3, Figure 2).</w:t>
+        <w:t xml:space="preserve">Across all 22 lipids, affinity correlated most strongly with the number of C=C double bonds (r = -0.87) and chain length (r = -0.70). Lipophilicity, polarity, and flexibility were weak or non-predictive (Table 3, Figure 2). Two caveats apply: the affinities span only ~2 kcal/mol (within Vina's error), so these are panel-level trends rather than reliable per-lipid rankings; and the predictive descriptors (unsaturation, chain length, MW, logP) are collinear, so their contributions cannot be cleanly separated - unsaturation is the strongest marginal association, not an isolated causal determinant. Consensus scoring (3.6) and MD (3.8) provide independent support.</w:t>
+      </w:r>
+    </w:p>
+    <w:p>
+      <w:pPr>
+        <w:spacing w:after="120" w:line="276"/>
+        <w:jc w:val="both"/>
+      </w:pPr>
+      <w:r>
+        <w:t xml:space="preserve">Structural basis of the unsaturation preference (same-length C18 series). To probe why unsaturation is favoured while controlling for chain length, a same-length (C18) series was examined - stearic (C18:0), oleic (C18:1), 9,11-octadecadienoic (C18:2), and the two octadecatrienoates (C18:3) (Table 4b, Figure 12). A simple contact count is uninformative and even misleading: because burial scales with chain length, the shorter saturated palmitic acid makes as many aromatic-cage contacts as the longer EPA (94 vs 82 within 4.5 A). The discriminating feature is specific: at fixed C18 length the affinity rises modestly with unsaturation (-7.63 for stearic to -8.13 for gamma-linolenic), and every cis double bond localises within alkene-pi contact distance (3.7-4.0 A) of an aromatic-cage residue (Tyr12/20/266, Phe22/33/69), whereas saturated stearic engages none (Figure 12). The cis geometry thus favours binding not by increasing overall contact but by positioning the double-bond pi-systems against the aromatic cage. This effect is modest (~0.3-0.5 kcal/mol at fixed length, within scoring error) and, being a geometric-proximity argument, does not establish optimal stacking orientation; it is a structural rationale for the unsaturation trend, not a strong determinant.</w:t>
+      </w:r>
+    </w:p>
+    <w:p>
+      <w:pPr>
+        <w:spacing w:after="120" w:line="276"/>
+      </w:pPr>
+      <w:r>
+        <w:rPr>
+          <w:b/>
+          <w:bCs/>
+          <w:sz w:val="19"/>
+          <w:szCs w:val="19"/>
+        </w:rPr>
+        <w:t xml:space="preserve">Table 4b. Same-length (C18) series: unsaturation and alkene-pi engagement.</w:t>
+      </w:r>
+    </w:p>
+    <w:tbl>
+      <w:tblPr>
+        <w:tblW w:type="dxa" w:w="9360"/>
+        <w:tblBorders>
+          <w:top w:val="single" w:color="auto" w:sz="4"/>
+          <w:left w:val="single" w:color="auto" w:sz="4"/>
+          <w:bottom w:val="single" w:color="auto" w:sz="4"/>
+          <w:right w:val="single" w:color="auto" w:sz="4"/>
+          <w:insideH w:val="single" w:color="auto" w:sz="4"/>
+          <w:insideV w:val="single" w:color="auto" w:sz="4"/>
+        </w:tblBorders>
+      </w:tblPr>
+      <w:tblGrid>
+        <w:gridCol w:w="2760"/>
+        <w:gridCol w:w="1400"/>
+        <w:gridCol w:w="2200"/>
+        <w:gridCol w:w="1900"/>
+        <w:gridCol w:w="1100"/>
+      </w:tblGrid>
+      <w:tr>
+        <w:trPr>
+          <w:tblHeader/>
+        </w:trPr>
+        <w:tc>
+          <w:tcPr>
+            <w:tcW w:type="dxa" w:w="2760"/>
+            <w:tcBorders>
+              <w:top w:val="single" w:color="BBBBBB" w:sz="1"/>
+              <w:left w:val="single" w:color="BBBBBB" w:sz="1"/>
+              <w:bottom w:val="single" w:color="BBBBBB" w:sz="1"/>
+              <w:right w:val="single" w:color="BBBBBB" w:sz="1"/>
+            </w:tcBorders>
+            <w:shd w:fill="1F4E79" w:val="clear"/>
+            <w:tcMar>
+              <w:top w:type="dxa" w:w="60"/>
+              <w:left w:type="dxa" w:w="100"/>
+              <w:bottom w:type="dxa" w:w="60"/>
+              <w:right w:type="dxa" w:w="100"/>
+            </w:tcMar>
+          </w:tcPr>
+          <w:p>
+            <w:r>
+              <w:rPr>
+                <w:b/>
+                <w:bCs/>
+                <w:color w:val="FFFFFF"/>
+                <w:sz w:val="19"/>
+                <w:szCs w:val="19"/>
+              </w:rPr>
+              <w:t xml:space="preserve">Lipid</w:t>
+            </w:r>
+          </w:p>
+        </w:tc>
+        <w:tc>
+          <w:tcPr>
+            <w:tcW w:type="dxa" w:w="1400"/>
+            <w:tcBorders>
+              <w:top w:val="single" w:color="BBBBBB" w:sz="1"/>
+              <w:left w:val="single" w:color="BBBBBB" w:sz="1"/>
+              <w:bottom w:val="single" w:color="BBBBBB" w:sz="1"/>
+              <w:right w:val="single" w:color="BBBBBB" w:sz="1"/>
+            </w:tcBorders>
+            <w:shd w:fill="1F4E79" w:val="clear"/>
+            <w:tcMar>
+              <w:top w:type="dxa" w:w="60"/>
+              <w:left w:type="dxa" w:w="100"/>
+              <w:bottom w:type="dxa" w:w="60"/>
+              <w:right w:type="dxa" w:w="100"/>
+            </w:tcMar>
+          </w:tcPr>
+          <w:p>
+            <w:r>
+              <w:rPr>
+                <w:b/>
+                <w:bCs/>
+                <w:color w:val="FFFFFF"/>
+                <w:sz w:val="19"/>
+                <w:szCs w:val="19"/>
+              </w:rPr>
+              <w:t xml:space="preserve">C18:x</w:t>
+            </w:r>
+          </w:p>
+        </w:tc>
+        <w:tc>
+          <w:tcPr>
+            <w:tcW w:type="dxa" w:w="2200"/>
+            <w:tcBorders>
+              <w:top w:val="single" w:color="BBBBBB" w:sz="1"/>
+              <w:left w:val="single" w:color="BBBBBB" w:sz="1"/>
+              <w:bottom w:val="single" w:color="BBBBBB" w:sz="1"/>
+              <w:right w:val="single" w:color="BBBBBB" w:sz="1"/>
+            </w:tcBorders>
+            <w:shd w:fill="1F4E79" w:val="clear"/>
+            <w:tcMar>
+              <w:top w:type="dxa" w:w="60"/>
+              <w:left w:type="dxa" w:w="100"/>
+              <w:bottom w:type="dxa" w:w="60"/>
+              <w:right w:type="dxa" w:w="100"/>
+            </w:tcMar>
+          </w:tcPr>
+          <w:p>
+            <w:r>
+              <w:rPr>
+                <w:b/>
+                <w:bCs/>
+                <w:color w:val="FFFFFF"/>
+                <w:sz w:val="19"/>
+                <w:szCs w:val="19"/>
+              </w:rPr>
+              <w:t xml:space="preserve">dG (kcal/mol)</w:t>
+            </w:r>
+          </w:p>
+        </w:tc>
+        <w:tc>
+          <w:tcPr>
+            <w:tcW w:type="dxa" w:w="1900"/>
+            <w:tcBorders>
+              <w:top w:val="single" w:color="BBBBBB" w:sz="1"/>
+              <w:left w:val="single" w:color="BBBBBB" w:sz="1"/>
+              <w:bottom w:val="single" w:color="BBBBBB" w:sz="1"/>
+              <w:right w:val="single" w:color="BBBBBB" w:sz="1"/>
+            </w:tcBorders>
+            <w:shd w:fill="1F4E79" w:val="clear"/>
+            <w:tcMar>
+              <w:top w:type="dxa" w:w="60"/>
+              <w:left w:type="dxa" w:w="100"/>
+              <w:bottom w:type="dxa" w:w="60"/>
+              <w:right w:type="dxa" w:w="100"/>
+            </w:tcMar>
+          </w:tcPr>
+          <w:p>
+            <w:r>
+              <w:rPr>
+                <w:b/>
+                <w:bCs/>
+                <w:color w:val="FFFFFF"/>
+                <w:sz w:val="19"/>
+                <w:szCs w:val="19"/>
+              </w:rPr>
+              <w:t xml:space="preserve">C=C in pi-contact</w:t>
+            </w:r>
+          </w:p>
+        </w:tc>
+        <w:tc>
+          <w:tcPr>
+            <w:tcW w:type="dxa" w:w="1100"/>
+            <w:tcBorders>
+              <w:top w:val="single" w:color="BBBBBB" w:sz="1"/>
+              <w:left w:val="single" w:color="BBBBBB" w:sz="1"/>
+              <w:bottom w:val="single" w:color="BBBBBB" w:sz="1"/>
+              <w:right w:val="single" w:color="BBBBBB" w:sz="1"/>
+            </w:tcBorders>
+            <w:shd w:fill="1F4E79" w:val="clear"/>
+            <w:tcMar>
+              <w:top w:type="dxa" w:w="60"/>
+              <w:left w:type="dxa" w:w="100"/>
+              <w:bottom w:type="dxa" w:w="60"/>
+              <w:right w:type="dxa" w:w="100"/>
+            </w:tcMar>
+          </w:tcPr>
+          <w:p>
+            <w:r>
+              <w:rPr>
+                <w:b/>
+                <w:bCs/>
+                <w:color w:val="FFFFFF"/>
+                <w:sz w:val="19"/>
+                <w:szCs w:val="19"/>
+              </w:rPr>
+              <w:t xml:space="preserve">closest C=C-&gt;ring (A)</w:t>
+            </w:r>
+          </w:p>
+        </w:tc>
+      </w:tr>
+      <w:tr>
+        <w:tc>
+          <w:tcPr>
+            <w:tcW w:type="dxa" w:w="2760"/>
+            <w:tcBorders>
+              <w:top w:val="single" w:color="BBBBBB" w:sz="1"/>
+              <w:left w:val="single" w:color="BBBBBB" w:sz="1"/>
+              <w:bottom w:val="single" w:color="BBBBBB" w:sz="1"/>
+              <w:right w:val="single" w:color="BBBBBB" w:sz="1"/>
+            </w:tcBorders>
+            <w:tcMar>
+              <w:top w:type="dxa" w:w="60"/>
+              <w:left w:type="dxa" w:w="100"/>
+              <w:bottom w:type="dxa" w:w="60"/>
+              <w:right w:type="dxa" w:w="100"/>
+            </w:tcMar>
+          </w:tcPr>
+          <w:p>
+            <w:r>
+              <w:rPr>
+                <w:b w:val="false"/>
+                <w:bCs w:val="false"/>
+                <w:sz w:val="19"/>
+                <w:szCs w:val="19"/>
+              </w:rPr>
+              <w:t xml:space="preserve">stearic</w:t>
+            </w:r>
+          </w:p>
+        </w:tc>
+        <w:tc>
+          <w:tcPr>
+            <w:tcW w:type="dxa" w:w="1400"/>
+            <w:tcBorders>
+              <w:top w:val="single" w:color="BBBBBB" w:sz="1"/>
+              <w:left w:val="single" w:color="BBBBBB" w:sz="1"/>
+              <w:bottom w:val="single" w:color="BBBBBB" w:sz="1"/>
+              <w:right w:val="single" w:color="BBBBBB" w:sz="1"/>
+            </w:tcBorders>
+            <w:tcMar>
+              <w:top w:type="dxa" w:w="60"/>
+              <w:left w:type="dxa" w:w="100"/>
+              <w:bottom w:type="dxa" w:w="60"/>
+              <w:right w:type="dxa" w:w="100"/>
+            </w:tcMar>
+          </w:tcPr>
+          <w:p>
+            <w:r>
+              <w:rPr>
+                <w:b w:val="false"/>
+                <w:bCs w:val="false"/>
+                <w:sz w:val="19"/>
+                <w:szCs w:val="19"/>
+              </w:rPr>
+              <w:t xml:space="preserve">C18:0</w:t>
+            </w:r>
+          </w:p>
+        </w:tc>
+        <w:tc>
+          <w:tcPr>
+            <w:tcW w:type="dxa" w:w="2200"/>
+            <w:tcBorders>
+              <w:top w:val="single" w:color="BBBBBB" w:sz="1"/>
+              <w:left w:val="single" w:color="BBBBBB" w:sz="1"/>
+              <w:bottom w:val="single" w:color="BBBBBB" w:sz="1"/>
+              <w:right w:val="single" w:color="BBBBBB" w:sz="1"/>
+            </w:tcBorders>
+            <w:tcMar>
+              <w:top w:type="dxa" w:w="60"/>
+              <w:left w:type="dxa" w:w="100"/>
+              <w:bottom w:type="dxa" w:w="60"/>
+              <w:right w:type="dxa" w:w="100"/>
+            </w:tcMar>
+          </w:tcPr>
+          <w:p>
+            <w:r>
+              <w:rPr>
+                <w:b w:val="false"/>
+                <w:bCs w:val="false"/>
+                <w:sz w:val="19"/>
+                <w:szCs w:val="19"/>
+              </w:rPr>
+              <w:t xml:space="preserve">-7.63</w:t>
+            </w:r>
+          </w:p>
+        </w:tc>
+        <w:tc>
+          <w:tcPr>
+            <w:tcW w:type="dxa" w:w="1900"/>
+            <w:tcBorders>
+              <w:top w:val="single" w:color="BBBBBB" w:sz="1"/>
+              <w:left w:val="single" w:color="BBBBBB" w:sz="1"/>
+              <w:bottom w:val="single" w:color="BBBBBB" w:sz="1"/>
+              <w:right w:val="single" w:color="BBBBBB" w:sz="1"/>
+            </w:tcBorders>
+            <w:tcMar>
+              <w:top w:type="dxa" w:w="60"/>
+              <w:left w:type="dxa" w:w="100"/>
+              <w:bottom w:type="dxa" w:w="60"/>
+              <w:right w:type="dxa" w:w="100"/>
+            </w:tcMar>
+          </w:tcPr>
+          <w:p>
+            <w:r>
+              <w:rPr>
+                <w:b w:val="false"/>
+                <w:bCs w:val="false"/>
+                <w:sz w:val="19"/>
+                <w:szCs w:val="19"/>
+              </w:rPr>
+              <w:t xml:space="preserve">0/0</w:t>
+            </w:r>
+          </w:p>
+        </w:tc>
+        <w:tc>
+          <w:tcPr>
+            <w:tcW w:type="dxa" w:w="1100"/>
+            <w:tcBorders>
+              <w:top w:val="single" w:color="BBBBBB" w:sz="1"/>
+              <w:left w:val="single" w:color="BBBBBB" w:sz="1"/>
+              <w:bottom w:val="single" w:color="BBBBBB" w:sz="1"/>
+              <w:right w:val="single" w:color="BBBBBB" w:sz="1"/>
+            </w:tcBorders>
+            <w:tcMar>
+              <w:top w:type="dxa" w:w="60"/>
+              <w:left w:type="dxa" w:w="100"/>
+              <w:bottom w:type="dxa" w:w="60"/>
+              <w:right w:type="dxa" w:w="100"/>
+            </w:tcMar>
+          </w:tcPr>
+          <w:p>
+            <w:r>
+              <w:rPr>
+                <w:b w:val="false"/>
+                <w:bCs w:val="false"/>
+                <w:sz w:val="19"/>
+                <w:szCs w:val="19"/>
+              </w:rPr>
+              <w:t xml:space="preserve">-</w:t>
+            </w:r>
+          </w:p>
+        </w:tc>
+      </w:tr>
+      <w:tr>
+        <w:tc>
+          <w:tcPr>
+            <w:tcW w:type="dxa" w:w="2760"/>
+            <w:tcBorders>
+              <w:top w:val="single" w:color="BBBBBB" w:sz="1"/>
+              <w:left w:val="single" w:color="BBBBBB" w:sz="1"/>
+              <w:bottom w:val="single" w:color="BBBBBB" w:sz="1"/>
+              <w:right w:val="single" w:color="BBBBBB" w:sz="1"/>
+            </w:tcBorders>
+            <w:tcMar>
+              <w:top w:type="dxa" w:w="60"/>
+              <w:left w:type="dxa" w:w="100"/>
+              <w:bottom w:type="dxa" w:w="60"/>
+              <w:right w:type="dxa" w:w="100"/>
+            </w:tcMar>
+          </w:tcPr>
+          <w:p>
+            <w:r>
+              <w:rPr>
+                <w:b w:val="false"/>
+                <w:bCs w:val="false"/>
+                <w:sz w:val="19"/>
+                <w:szCs w:val="19"/>
+              </w:rPr>
+              <w:t xml:space="preserve">oleic</w:t>
+            </w:r>
+          </w:p>
+        </w:tc>
+        <w:tc>
+          <w:tcPr>
+            <w:tcW w:type="dxa" w:w="1400"/>
+            <w:tcBorders>
+              <w:top w:val="single" w:color="BBBBBB" w:sz="1"/>
+              <w:left w:val="single" w:color="BBBBBB" w:sz="1"/>
+              <w:bottom w:val="single" w:color="BBBBBB" w:sz="1"/>
+              <w:right w:val="single" w:color="BBBBBB" w:sz="1"/>
+            </w:tcBorders>
+            <w:tcMar>
+              <w:top w:type="dxa" w:w="60"/>
+              <w:left w:type="dxa" w:w="100"/>
+              <w:bottom w:type="dxa" w:w="60"/>
+              <w:right w:type="dxa" w:w="100"/>
+            </w:tcMar>
+          </w:tcPr>
+          <w:p>
+            <w:r>
+              <w:rPr>
+                <w:b w:val="false"/>
+                <w:bCs w:val="false"/>
+                <w:sz w:val="19"/>
+                <w:szCs w:val="19"/>
+              </w:rPr>
+              <w:t xml:space="preserve">C18:1</w:t>
+            </w:r>
+          </w:p>
+        </w:tc>
+        <w:tc>
+          <w:tcPr>
+            <w:tcW w:type="dxa" w:w="2200"/>
+            <w:tcBorders>
+              <w:top w:val="single" w:color="BBBBBB" w:sz="1"/>
+              <w:left w:val="single" w:color="BBBBBB" w:sz="1"/>
+              <w:bottom w:val="single" w:color="BBBBBB" w:sz="1"/>
+              <w:right w:val="single" w:color="BBBBBB" w:sz="1"/>
+            </w:tcBorders>
+            <w:tcMar>
+              <w:top w:type="dxa" w:w="60"/>
+              <w:left w:type="dxa" w:w="100"/>
+              <w:bottom w:type="dxa" w:w="60"/>
+              <w:right w:type="dxa" w:w="100"/>
+            </w:tcMar>
+          </w:tcPr>
+          <w:p>
+            <w:r>
+              <w:rPr>
+                <w:b w:val="false"/>
+                <w:bCs w:val="false"/>
+                <w:sz w:val="19"/>
+                <w:szCs w:val="19"/>
+              </w:rPr>
+              <w:t xml:space="preserve">-7.90</w:t>
+            </w:r>
+          </w:p>
+        </w:tc>
+        <w:tc>
+          <w:tcPr>
+            <w:tcW w:type="dxa" w:w="1900"/>
+            <w:tcBorders>
+              <w:top w:val="single" w:color="BBBBBB" w:sz="1"/>
+              <w:left w:val="single" w:color="BBBBBB" w:sz="1"/>
+              <w:bottom w:val="single" w:color="BBBBBB" w:sz="1"/>
+              <w:right w:val="single" w:color="BBBBBB" w:sz="1"/>
+            </w:tcBorders>
+            <w:tcMar>
+              <w:top w:type="dxa" w:w="60"/>
+              <w:left w:type="dxa" w:w="100"/>
+              <w:bottom w:type="dxa" w:w="60"/>
+              <w:right w:type="dxa" w:w="100"/>
+            </w:tcMar>
+          </w:tcPr>
+          <w:p>
+            <w:r>
+              <w:rPr>
+                <w:b w:val="false"/>
+                <w:bCs w:val="false"/>
+                <w:sz w:val="19"/>
+                <w:szCs w:val="19"/>
+              </w:rPr>
+              <w:t xml:space="preserve">1/1</w:t>
+            </w:r>
+          </w:p>
+        </w:tc>
+        <w:tc>
+          <w:tcPr>
+            <w:tcW w:type="dxa" w:w="1100"/>
+            <w:tcBorders>
+              <w:top w:val="single" w:color="BBBBBB" w:sz="1"/>
+              <w:left w:val="single" w:color="BBBBBB" w:sz="1"/>
+              <w:bottom w:val="single" w:color="BBBBBB" w:sz="1"/>
+              <w:right w:val="single" w:color="BBBBBB" w:sz="1"/>
+            </w:tcBorders>
+            <w:tcMar>
+              <w:top w:type="dxa" w:w="60"/>
+              <w:left w:type="dxa" w:w="100"/>
+              <w:bottom w:type="dxa" w:w="60"/>
+              <w:right w:type="dxa" w:w="100"/>
+            </w:tcMar>
+          </w:tcPr>
+          <w:p>
+            <w:r>
+              <w:rPr>
+                <w:b w:val="false"/>
+                <w:bCs w:val="false"/>
+                <w:sz w:val="19"/>
+                <w:szCs w:val="19"/>
+              </w:rPr>
+              <w:t xml:space="preserve">5.2</w:t>
+            </w:r>
+          </w:p>
+        </w:tc>
+      </w:tr>
+      <w:tr>
+        <w:tc>
+          <w:tcPr>
+            <w:tcW w:type="dxa" w:w="2760"/>
+            <w:tcBorders>
+              <w:top w:val="single" w:color="BBBBBB" w:sz="1"/>
+              <w:left w:val="single" w:color="BBBBBB" w:sz="1"/>
+              <w:bottom w:val="single" w:color="BBBBBB" w:sz="1"/>
+              <w:right w:val="single" w:color="BBBBBB" w:sz="1"/>
+            </w:tcBorders>
+            <w:tcMar>
+              <w:top w:type="dxa" w:w="60"/>
+              <w:left w:type="dxa" w:w="100"/>
+              <w:bottom w:type="dxa" w:w="60"/>
+              <w:right w:type="dxa" w:w="100"/>
+            </w:tcMar>
+          </w:tcPr>
+          <w:p>
+            <w:r>
+              <w:rPr>
+                <w:b w:val="false"/>
+                <w:bCs w:val="false"/>
+                <w:sz w:val="19"/>
+                <w:szCs w:val="19"/>
+              </w:rPr>
+              <w:t xml:space="preserve">9,11-octadecadienoic</w:t>
+            </w:r>
+          </w:p>
+        </w:tc>
+        <w:tc>
+          <w:tcPr>
+            <w:tcW w:type="dxa" w:w="1400"/>
+            <w:tcBorders>
+              <w:top w:val="single" w:color="BBBBBB" w:sz="1"/>
+              <w:left w:val="single" w:color="BBBBBB" w:sz="1"/>
+              <w:bottom w:val="single" w:color="BBBBBB" w:sz="1"/>
+              <w:right w:val="single" w:color="BBBBBB" w:sz="1"/>
+            </w:tcBorders>
+            <w:tcMar>
+              <w:top w:type="dxa" w:w="60"/>
+              <w:left w:type="dxa" w:w="100"/>
+              <w:bottom w:type="dxa" w:w="60"/>
+              <w:right w:type="dxa" w:w="100"/>
+            </w:tcMar>
+          </w:tcPr>
+          <w:p>
+            <w:r>
+              <w:rPr>
+                <w:b w:val="false"/>
+                <w:bCs w:val="false"/>
+                <w:sz w:val="19"/>
+                <w:szCs w:val="19"/>
+              </w:rPr>
+              <w:t xml:space="preserve">C18:2</w:t>
+            </w:r>
+          </w:p>
+        </w:tc>
+        <w:tc>
+          <w:tcPr>
+            <w:tcW w:type="dxa" w:w="2200"/>
+            <w:tcBorders>
+              <w:top w:val="single" w:color="BBBBBB" w:sz="1"/>
+              <w:left w:val="single" w:color="BBBBBB" w:sz="1"/>
+              <w:bottom w:val="single" w:color="BBBBBB" w:sz="1"/>
+              <w:right w:val="single" w:color="BBBBBB" w:sz="1"/>
+            </w:tcBorders>
+            <w:tcMar>
+              <w:top w:type="dxa" w:w="60"/>
+              <w:left w:type="dxa" w:w="100"/>
+              <w:bottom w:type="dxa" w:w="60"/>
+              <w:right w:type="dxa" w:w="100"/>
+            </w:tcMar>
+          </w:tcPr>
+          <w:p>
+            <w:r>
+              <w:rPr>
+                <w:b w:val="false"/>
+                <w:bCs w:val="false"/>
+                <w:sz w:val="19"/>
+                <w:szCs w:val="19"/>
+              </w:rPr>
+              <w:t xml:space="preserve">-7.80</w:t>
+            </w:r>
+          </w:p>
+        </w:tc>
+        <w:tc>
+          <w:tcPr>
+            <w:tcW w:type="dxa" w:w="1900"/>
+            <w:tcBorders>
+              <w:top w:val="single" w:color="BBBBBB" w:sz="1"/>
+              <w:left w:val="single" w:color="BBBBBB" w:sz="1"/>
+              <w:bottom w:val="single" w:color="BBBBBB" w:sz="1"/>
+              <w:right w:val="single" w:color="BBBBBB" w:sz="1"/>
+            </w:tcBorders>
+            <w:tcMar>
+              <w:top w:type="dxa" w:w="60"/>
+              <w:left w:type="dxa" w:w="100"/>
+              <w:bottom w:type="dxa" w:w="60"/>
+              <w:right w:type="dxa" w:w="100"/>
+            </w:tcMar>
+          </w:tcPr>
+          <w:p>
+            <w:r>
+              <w:rPr>
+                <w:b w:val="false"/>
+                <w:bCs w:val="false"/>
+                <w:sz w:val="19"/>
+                <w:szCs w:val="19"/>
+              </w:rPr>
+              <w:t xml:space="preserve">2/2</w:t>
+            </w:r>
+          </w:p>
+        </w:tc>
+        <w:tc>
+          <w:tcPr>
+            <w:tcW w:type="dxa" w:w="1100"/>
+            <w:tcBorders>
+              <w:top w:val="single" w:color="BBBBBB" w:sz="1"/>
+              <w:left w:val="single" w:color="BBBBBB" w:sz="1"/>
+              <w:bottom w:val="single" w:color="BBBBBB" w:sz="1"/>
+              <w:right w:val="single" w:color="BBBBBB" w:sz="1"/>
+            </w:tcBorders>
+            <w:tcMar>
+              <w:top w:type="dxa" w:w="60"/>
+              <w:left w:type="dxa" w:w="100"/>
+              <w:bottom w:type="dxa" w:w="60"/>
+              <w:right w:type="dxa" w:w="100"/>
+            </w:tcMar>
+          </w:tcPr>
+          <w:p>
+            <w:r>
+              <w:rPr>
+                <w:b w:val="false"/>
+                <w:bCs w:val="false"/>
+                <w:sz w:val="19"/>
+                <w:szCs w:val="19"/>
+              </w:rPr>
+              <w:t xml:space="preserve">3.8</w:t>
+            </w:r>
+          </w:p>
+        </w:tc>
+      </w:tr>
+      <w:tr>
+        <w:tc>
+          <w:tcPr>
+            <w:tcW w:type="dxa" w:w="2760"/>
+            <w:tcBorders>
+              <w:top w:val="single" w:color="BBBBBB" w:sz="1"/>
+              <w:left w:val="single" w:color="BBBBBB" w:sz="1"/>
+              <w:bottom w:val="single" w:color="BBBBBB" w:sz="1"/>
+              <w:right w:val="single" w:color="BBBBBB" w:sz="1"/>
+            </w:tcBorders>
+            <w:tcMar>
+              <w:top w:type="dxa" w:w="60"/>
+              <w:left w:type="dxa" w:w="100"/>
+              <w:bottom w:type="dxa" w:w="60"/>
+              <w:right w:type="dxa" w:w="100"/>
+            </w:tcMar>
+          </w:tcPr>
+          <w:p>
+            <w:r>
+              <w:rPr>
+                <w:b w:val="false"/>
+                <w:bCs w:val="false"/>
+                <w:sz w:val="19"/>
+                <w:szCs w:val="19"/>
+              </w:rPr>
+              <w:t xml:space="preserve">gamma-linolenic</w:t>
+            </w:r>
+          </w:p>
+        </w:tc>
+        <w:tc>
+          <w:tcPr>
+            <w:tcW w:type="dxa" w:w="1400"/>
+            <w:tcBorders>
+              <w:top w:val="single" w:color="BBBBBB" w:sz="1"/>
+              <w:left w:val="single" w:color="BBBBBB" w:sz="1"/>
+              <w:bottom w:val="single" w:color="BBBBBB" w:sz="1"/>
+              <w:right w:val="single" w:color="BBBBBB" w:sz="1"/>
+            </w:tcBorders>
+            <w:tcMar>
+              <w:top w:type="dxa" w:w="60"/>
+              <w:left w:type="dxa" w:w="100"/>
+              <w:bottom w:type="dxa" w:w="60"/>
+              <w:right w:type="dxa" w:w="100"/>
+            </w:tcMar>
+          </w:tcPr>
+          <w:p>
+            <w:r>
+              <w:rPr>
+                <w:b w:val="false"/>
+                <w:bCs w:val="false"/>
+                <w:sz w:val="19"/>
+                <w:szCs w:val="19"/>
+              </w:rPr>
+              <w:t xml:space="preserve">C18:3</w:t>
+            </w:r>
+          </w:p>
+        </w:tc>
+        <w:tc>
+          <w:tcPr>
+            <w:tcW w:type="dxa" w:w="2200"/>
+            <w:tcBorders>
+              <w:top w:val="single" w:color="BBBBBB" w:sz="1"/>
+              <w:left w:val="single" w:color="BBBBBB" w:sz="1"/>
+              <w:bottom w:val="single" w:color="BBBBBB" w:sz="1"/>
+              <w:right w:val="single" w:color="BBBBBB" w:sz="1"/>
+            </w:tcBorders>
+            <w:tcMar>
+              <w:top w:type="dxa" w:w="60"/>
+              <w:left w:type="dxa" w:w="100"/>
+              <w:bottom w:type="dxa" w:w="60"/>
+              <w:right w:type="dxa" w:w="100"/>
+            </w:tcMar>
+          </w:tcPr>
+          <w:p>
+            <w:r>
+              <w:rPr>
+                <w:b w:val="false"/>
+                <w:bCs w:val="false"/>
+                <w:sz w:val="19"/>
+                <w:szCs w:val="19"/>
+              </w:rPr>
+              <w:t xml:space="preserve">-8.13</w:t>
+            </w:r>
+          </w:p>
+        </w:tc>
+        <w:tc>
+          <w:tcPr>
+            <w:tcW w:type="dxa" w:w="1900"/>
+            <w:tcBorders>
+              <w:top w:val="single" w:color="BBBBBB" w:sz="1"/>
+              <w:left w:val="single" w:color="BBBBBB" w:sz="1"/>
+              <w:bottom w:val="single" w:color="BBBBBB" w:sz="1"/>
+              <w:right w:val="single" w:color="BBBBBB" w:sz="1"/>
+            </w:tcBorders>
+            <w:tcMar>
+              <w:top w:type="dxa" w:w="60"/>
+              <w:left w:type="dxa" w:w="100"/>
+              <w:bottom w:type="dxa" w:w="60"/>
+              <w:right w:type="dxa" w:w="100"/>
+            </w:tcMar>
+          </w:tcPr>
+          <w:p>
+            <w:r>
+              <w:rPr>
+                <w:b w:val="false"/>
+                <w:bCs w:val="false"/>
+                <w:sz w:val="19"/>
+                <w:szCs w:val="19"/>
+              </w:rPr>
+              <w:t xml:space="preserve">3/3</w:t>
+            </w:r>
+          </w:p>
+        </w:tc>
+        <w:tc>
+          <w:tcPr>
+            <w:tcW w:type="dxa" w:w="1100"/>
+            <w:tcBorders>
+              <w:top w:val="single" w:color="BBBBBB" w:sz="1"/>
+              <w:left w:val="single" w:color="BBBBBB" w:sz="1"/>
+              <w:bottom w:val="single" w:color="BBBBBB" w:sz="1"/>
+              <w:right w:val="single" w:color="BBBBBB" w:sz="1"/>
+            </w:tcBorders>
+            <w:tcMar>
+              <w:top w:type="dxa" w:w="60"/>
+              <w:left w:type="dxa" w:w="100"/>
+              <w:bottom w:type="dxa" w:w="60"/>
+              <w:right w:type="dxa" w:w="100"/>
+            </w:tcMar>
+          </w:tcPr>
+          <w:p>
+            <w:r>
+              <w:rPr>
+                <w:b w:val="false"/>
+                <w:bCs w:val="false"/>
+                <w:sz w:val="19"/>
+                <w:szCs w:val="19"/>
+              </w:rPr>
+              <w:t xml:space="preserve">3.7</w:t>
+            </w:r>
+          </w:p>
+        </w:tc>
+      </w:tr>
+      <w:tr>
+        <w:tc>
+          <w:tcPr>
+            <w:tcW w:type="dxa" w:w="2760"/>
+            <w:tcBorders>
+              <w:top w:val="single" w:color="BBBBBB" w:sz="1"/>
+              <w:left w:val="single" w:color="BBBBBB" w:sz="1"/>
+              <w:bottom w:val="single" w:color="BBBBBB" w:sz="1"/>
+              <w:right w:val="single" w:color="BBBBBB" w:sz="1"/>
+            </w:tcBorders>
+            <w:tcMar>
+              <w:top w:type="dxa" w:w="60"/>
+              <w:left w:type="dxa" w:w="100"/>
+              <w:bottom w:type="dxa" w:w="60"/>
+              <w:right w:type="dxa" w:w="100"/>
+            </w:tcMar>
+          </w:tcPr>
+          <w:p>
+            <w:r>
+              <w:rPr>
+                <w:b w:val="false"/>
+                <w:bCs w:val="false"/>
+                <w:sz w:val="19"/>
+                <w:szCs w:val="19"/>
+              </w:rPr>
+              <w:t xml:space="preserve">alpha-linolenic</w:t>
+            </w:r>
+          </w:p>
+        </w:tc>
+        <w:tc>
+          <w:tcPr>
+            <w:tcW w:type="dxa" w:w="1400"/>
+            <w:tcBorders>
+              <w:top w:val="single" w:color="BBBBBB" w:sz="1"/>
+              <w:left w:val="single" w:color="BBBBBB" w:sz="1"/>
+              <w:bottom w:val="single" w:color="BBBBBB" w:sz="1"/>
+              <w:right w:val="single" w:color="BBBBBB" w:sz="1"/>
+            </w:tcBorders>
+            <w:tcMar>
+              <w:top w:type="dxa" w:w="60"/>
+              <w:left w:type="dxa" w:w="100"/>
+              <w:bottom w:type="dxa" w:w="60"/>
+              <w:right w:type="dxa" w:w="100"/>
+            </w:tcMar>
+          </w:tcPr>
+          <w:p>
+            <w:r>
+              <w:rPr>
+                <w:b w:val="false"/>
+                <w:bCs w:val="false"/>
+                <w:sz w:val="19"/>
+                <w:szCs w:val="19"/>
+              </w:rPr>
+              <w:t xml:space="preserve">C18:3</w:t>
+            </w:r>
+          </w:p>
+        </w:tc>
+        <w:tc>
+          <w:tcPr>
+            <w:tcW w:type="dxa" w:w="2200"/>
+            <w:tcBorders>
+              <w:top w:val="single" w:color="BBBBBB" w:sz="1"/>
+              <w:left w:val="single" w:color="BBBBBB" w:sz="1"/>
+              <w:bottom w:val="single" w:color="BBBBBB" w:sz="1"/>
+              <w:right w:val="single" w:color="BBBBBB" w:sz="1"/>
+            </w:tcBorders>
+            <w:tcMar>
+              <w:top w:type="dxa" w:w="60"/>
+              <w:left w:type="dxa" w:w="100"/>
+              <w:bottom w:type="dxa" w:w="60"/>
+              <w:right w:type="dxa" w:w="100"/>
+            </w:tcMar>
+          </w:tcPr>
+          <w:p>
+            <w:r>
+              <w:rPr>
+                <w:b w:val="false"/>
+                <w:bCs w:val="false"/>
+                <w:sz w:val="19"/>
+                <w:szCs w:val="19"/>
+              </w:rPr>
+              <w:t xml:space="preserve">-7.91</w:t>
+            </w:r>
+          </w:p>
+        </w:tc>
+        <w:tc>
+          <w:tcPr>
+            <w:tcW w:type="dxa" w:w="1900"/>
+            <w:tcBorders>
+              <w:top w:val="single" w:color="BBBBBB" w:sz="1"/>
+              <w:left w:val="single" w:color="BBBBBB" w:sz="1"/>
+              <w:bottom w:val="single" w:color="BBBBBB" w:sz="1"/>
+              <w:right w:val="single" w:color="BBBBBB" w:sz="1"/>
+            </w:tcBorders>
+            <w:tcMar>
+              <w:top w:type="dxa" w:w="60"/>
+              <w:left w:type="dxa" w:w="100"/>
+              <w:bottom w:type="dxa" w:w="60"/>
+              <w:right w:type="dxa" w:w="100"/>
+            </w:tcMar>
+          </w:tcPr>
+          <w:p>
+            <w:r>
+              <w:rPr>
+                <w:b w:val="false"/>
+                <w:bCs w:val="false"/>
+                <w:sz w:val="19"/>
+                <w:szCs w:val="19"/>
+              </w:rPr>
+              <w:t xml:space="preserve">3/3</w:t>
+            </w:r>
+          </w:p>
+        </w:tc>
+        <w:tc>
+          <w:tcPr>
+            <w:tcW w:type="dxa" w:w="1100"/>
+            <w:tcBorders>
+              <w:top w:val="single" w:color="BBBBBB" w:sz="1"/>
+              <w:left w:val="single" w:color="BBBBBB" w:sz="1"/>
+              <w:bottom w:val="single" w:color="BBBBBB" w:sz="1"/>
+              <w:right w:val="single" w:color="BBBBBB" w:sz="1"/>
+            </w:tcBorders>
+            <w:tcMar>
+              <w:top w:type="dxa" w:w="60"/>
+              <w:left w:type="dxa" w:w="100"/>
+              <w:bottom w:type="dxa" w:w="60"/>
+              <w:right w:type="dxa" w:w="100"/>
+            </w:tcMar>
+          </w:tcPr>
+          <w:p>
+            <w:r>
+              <w:rPr>
+                <w:b w:val="false"/>
+                <w:bCs w:val="false"/>
+                <w:sz w:val="19"/>
+                <w:szCs w:val="19"/>
+              </w:rPr>
+              <w:t xml:space="preserve">4.0</w:t>
+            </w:r>
+          </w:p>
+        </w:tc>
+      </w:tr>
+    </w:tbl>
+    <w:p>
+      <w:pPr>
+        <w:spacing w:after="60" w:before="120"/>
+        <w:jc w:val="center"/>
+      </w:pPr>
+      <w:r>
+        <w:drawing>
+          <wp:inline distT="0" distB="0" distL="0" distR="0">
+            <wp:extent cx="5943600" cy="2771775"/>
+            <wp:effectExtent t="0" r="0" b="0" l="0"/>
+            <wp:docPr id="1" name="Figure 12. Structural basis of the unsaturation preference (same-length C18). (A) stearic (C18:0) and (B) gamma-linolenic (C18:3) in the ToxT aromatic cage (orange: Tyr12/20/266, Phe22/33/69). The cis double bonds kink the chain and pack against the aromatic rings (alkene-pi, 3.7-4.0 A; all three engaged); the saturated chain makes no such pi-contacts." descr="Figure 12. Structural basis of the unsaturation preference (same-length C18). (A) stearic (C18:0) and (B) gamma-linolenic (C18:3) in the ToxT aromatic cage (orange: Tyr12/20/266, Phe22/33/69). The cis double bonds kink the chain and pack against the aromatic rings (alkene-pi, 3.7-4.0 A; all three engaged); the saturated chain makes no such pi-contacts." title="Figure 12. Structural basis of the unsaturation preference (same-length C18). (A) stearic (C18:0) and (B) gamma-linolenic (C18:3) in the ToxT aromatic cage (orange: Tyr12/20/266, Phe22/33/69). The cis double bonds kink the chain and pack against the aromatic rings (alkene-pi, 3.7-4.0 A; all three engaged); the saturated chain makes no such pi-contacts."/>
+            <wp:cNvGraphicFramePr>
+              <a:graphicFrameLocks xmlns:a="http://schemas.openxmlformats.org/drawingml/2006/main" noChangeAspect="1"/>
+            </wp:cNvGraphicFramePr>
+            <a:graphic xmlns:a="http://schemas.openxmlformats.org/drawingml/2006/main">
+              <a:graphicData uri="http://schemas.openxmlformats.org/drawingml/2006/picture">
+                <pic:pic xmlns:pic="http://schemas.openxmlformats.org/drawingml/2006/picture">
+                  <pic:nvPicPr>
+                    <pic:cNvPr id="0" name="" descr=""/>
+                    <pic:cNvPicPr>
+                      <a:picLocks noChangeAspect="1" noChangeArrowheads="1"/>
+                    </pic:cNvPicPr>
+                  </pic:nvPicPr>
+                  <pic:blipFill>
+                    <a:blip r:embed="rId9" cstate="none"/>
+                    <a:srcRect/>
+                    <a:stretch>
+                      <a:fillRect/>
+                    </a:stretch>
+                  </pic:blipFill>
+                  <pic:spPr bwMode="auto">
+                    <a:xfrm>
+                      <a:off x="0" y="0"/>
+                      <a:ext cx="5943600" cy="2771775"/>
+                    </a:xfrm>
+                    <a:prstGeom prst="rect">
+                      <a:avLst/>
+                    </a:prstGeom>
+                  </pic:spPr>
+                </pic:pic>
+              </a:graphicData>
+            </a:graphic>
+          </wp:inline>
+        </w:drawing>
+      </w:r>
+    </w:p>
+    <w:p>
+      <w:pPr>
+        <w:spacing w:after="200"/>
+        <w:jc w:val="center"/>
+      </w:pPr>
+      <w:r>
+        <w:rPr>
+          <w:i/>
+          <w:iCs/>
+          <w:sz w:val="18"/>
+          <w:szCs w:val="18"/>
+        </w:rPr>
+        <w:t xml:space="preserve">Figure 12. Structural basis of the unsaturation preference (same-length C18). (A) stearic (C18:0) and (B) gamma-linolenic (C18:3) in the ToxT aromatic cage (orange: Tyr12/20/266, Phe22/33/69). The cis double bonds kink the chain and pack against the aromatic rings (alkene-pi, 3.7-4.0 A; all three engaged); the saturated chain makes no such pi-contacts.</w:t>
       </w:r>
     </w:p>
     <w:p>
@@ -3489,7 +4458,7 @@
                     </pic:cNvPicPr>
                   </pic:nvPicPr>
                   <pic:blipFill>
-                    <a:blip r:embed="rId9" cstate="none"/>
+                    <a:blip r:embed="rId10" cstate="none"/>
                     <a:srcRect/>
                     <a:stretch>
                       <a:fillRect/>
@@ -5335,7 +6304,7 @@
                     </pic:cNvPicPr>
                   </pic:nvPicPr>
                   <pic:blipFill>
-                    <a:blip r:embed="rId10" cstate="none"/>
+                    <a:blip r:embed="rId11" cstate="none"/>
                     <a:srcRect/>
                     <a:stretch>
                       <a:fillRect/>
@@ -5396,7 +6365,7 @@
                     </pic:cNvPicPr>
                   </pic:nvPicPr>
                   <pic:blipFill>
-                    <a:blip r:embed="rId11" cstate="none"/>
+                    <a:blip r:embed="rId12" cstate="none"/>
                     <a:srcRect/>
                     <a:stretch>
                       <a:fillRect/>
@@ -6976,7 +7945,7 @@
                     </pic:cNvPicPr>
                   </pic:nvPicPr>
                   <pic:blipFill>
-                    <a:blip r:embed="rId12" cstate="none"/>
+                    <a:blip r:embed="rId13" cstate="none"/>
                     <a:srcRect/>
                     <a:stretch>
                       <a:fillRect/>
@@ -7015,20 +7984,6 @@
     </w:p>
     <w:p>
       <w:pPr>
-        <w:spacing w:after="120" w:line="276"/>
-      </w:pPr>
-      <w:r>
-        <w:rPr>
-          <w:i/>
-          <w:iCs/>
-          <w:sz w:val="19"/>
-          <w:szCs w:val="19"/>
-        </w:rPr>
-        <w:t xml:space="preserve">Positive (native palmitoleate), negative (glucose decoy; apo ToxT) and weak-binder (pentadecanal, tridecanoic) control simulations are in progress and will be added on completion.</w:t>
-      </w:r>
-    </w:p>
-    <w:p>
-      <w:pPr>
         <w:pStyle w:val="Heading2"/>
       </w:pPr>
       <w:r>
@@ -7041,7 +7996,7 @@
         <w:jc w:val="both"/>
       </w:pPr>
       <w:r>
-        <w:t xml:space="preserve">Because the panel was docked into a predefined box, we verified by blind docking over the entire ToxT surface that this pocket is genuinely preferred, not merely imposed. The protocol was validated by recovery of the native ligand: with no pocket bias, palmitoleate's top pose localized 0.6 A from its crystallographic position (Table 6). For the strongly-binding polyunsaturated lipids every pose fell in the fatty-acid pocket (EPA 15/15, gamma-linolenic 8/8 modes) and no other site scored higher. Palmitic acid placed its single best pose in the pocket (1.5 A) but scattered its remaining poses over the surface (1/20), consistent with weak, non-specific association. Thus strong unsaturated lipids are pocket-selective while saturated lipids bind loosely, mirroring the affinity structure-activity relationship; no competing high-affinity site was detected.</w:t>
+        <w:t xml:space="preserve">Because the panel was docked into a predefined box, we verified by blind docking over the entire ToxT surface that this pocket is genuinely preferred, not merely imposed. The protocol was validated by recovery of the native ligand: with no pocket bias, palmitoleate's top pose localized 0.6 A from its crystallographic position (Table 6). For the strongly-binding polyunsaturated lipids every pose fell in the fatty-acid pocket (EPA 15/15, gamma-linolenic 8/8 modes) and no other site scored higher. Palmitic acid placed its single best pose in the pocket (1.5 A) but scattered its remaining poses over the surface (1/20). In sharp contrast, the glucose decoy placed none of its poses in the pocket (0/20; best pose 17 A away, -5.5 kcal/mol), showing the pocket selects fatty acids over a non-lipid. Thus strong unsaturated lipids are pocket-selective, saturated lipids bind loosely, and the non-lipid decoy is excluded, mirroring the affinity structure-activity relationship; no competing high-affinity site was detected.</w:t>
       </w:r>
     </w:p>
     <w:p>
@@ -7657,6 +8612,120 @@
           </w:p>
         </w:tc>
       </w:tr>
+      <w:tr>
+        <w:tc>
+          <w:tcPr>
+            <w:tcW w:type="dxa" w:w="3060"/>
+            <w:tcBorders>
+              <w:top w:val="single" w:color="BBBBBB" w:sz="1"/>
+              <w:left w:val="single" w:color="BBBBBB" w:sz="1"/>
+              <w:bottom w:val="single" w:color="BBBBBB" w:sz="1"/>
+              <w:right w:val="single" w:color="BBBBBB" w:sz="1"/>
+            </w:tcBorders>
+            <w:tcMar>
+              <w:top w:type="dxa" w:w="60"/>
+              <w:left w:type="dxa" w:w="100"/>
+              <w:bottom w:type="dxa" w:w="60"/>
+              <w:right w:type="dxa" w:w="100"/>
+            </w:tcMar>
+          </w:tcPr>
+          <w:p>
+            <w:r>
+              <w:rPr>
+                <w:b w:val="false"/>
+                <w:bCs w:val="false"/>
+                <w:sz w:val="19"/>
+                <w:szCs w:val="19"/>
+              </w:rPr>
+              <w:t xml:space="preserve">glucose (decoy)</w:t>
+            </w:r>
+          </w:p>
+        </w:tc>
+        <w:tc>
+          <w:tcPr>
+            <w:tcW w:type="dxa" w:w="2400"/>
+            <w:tcBorders>
+              <w:top w:val="single" w:color="BBBBBB" w:sz="1"/>
+              <w:left w:val="single" w:color="BBBBBB" w:sz="1"/>
+              <w:bottom w:val="single" w:color="BBBBBB" w:sz="1"/>
+              <w:right w:val="single" w:color="BBBBBB" w:sz="1"/>
+            </w:tcBorders>
+            <w:tcMar>
+              <w:top w:type="dxa" w:w="60"/>
+              <w:left w:type="dxa" w:w="100"/>
+              <w:bottom w:type="dxa" w:w="60"/>
+              <w:right w:type="dxa" w:w="100"/>
+            </w:tcMar>
+          </w:tcPr>
+          <w:p>
+            <w:r>
+              <w:rPr>
+                <w:b w:val="false"/>
+                <w:bCs w:val="false"/>
+                <w:sz w:val="19"/>
+                <w:szCs w:val="19"/>
+              </w:rPr>
+              <w:t xml:space="preserve">-5.54</w:t>
+            </w:r>
+          </w:p>
+        </w:tc>
+        <w:tc>
+          <w:tcPr>
+            <w:tcW w:type="dxa" w:w="2400"/>
+            <w:tcBorders>
+              <w:top w:val="single" w:color="BBBBBB" w:sz="1"/>
+              <w:left w:val="single" w:color="BBBBBB" w:sz="1"/>
+              <w:bottom w:val="single" w:color="BBBBBB" w:sz="1"/>
+              <w:right w:val="single" w:color="BBBBBB" w:sz="1"/>
+            </w:tcBorders>
+            <w:tcMar>
+              <w:top w:type="dxa" w:w="60"/>
+              <w:left w:type="dxa" w:w="100"/>
+              <w:bottom w:type="dxa" w:w="60"/>
+              <w:right w:type="dxa" w:w="100"/>
+            </w:tcMar>
+          </w:tcPr>
+          <w:p>
+            <w:r>
+              <w:rPr>
+                <w:b w:val="false"/>
+                <w:bCs w:val="false"/>
+                <w:sz w:val="19"/>
+                <w:szCs w:val="19"/>
+              </w:rPr>
+              <w:t xml:space="preserve">17.0</w:t>
+            </w:r>
+          </w:p>
+        </w:tc>
+        <w:tc>
+          <w:tcPr>
+            <w:tcW w:type="dxa" w:w="1500"/>
+            <w:tcBorders>
+              <w:top w:val="single" w:color="BBBBBB" w:sz="1"/>
+              <w:left w:val="single" w:color="BBBBBB" w:sz="1"/>
+              <w:bottom w:val="single" w:color="BBBBBB" w:sz="1"/>
+              <w:right w:val="single" w:color="BBBBBB" w:sz="1"/>
+            </w:tcBorders>
+            <w:tcMar>
+              <w:top w:type="dxa" w:w="60"/>
+              <w:left w:type="dxa" w:w="100"/>
+              <w:bottom w:type="dxa" w:w="60"/>
+              <w:right w:type="dxa" w:w="100"/>
+            </w:tcMar>
+          </w:tcPr>
+          <w:p>
+            <w:r>
+              <w:rPr>
+                <w:b w:val="false"/>
+                <w:bCs w:val="false"/>
+                <w:sz w:val="19"/>
+                <w:szCs w:val="19"/>
+              </w:rPr>
+              <w:t xml:space="preserve">0/20</w:t>
+            </w:r>
+          </w:p>
+        </w:tc>
+      </w:tr>
     </w:tbl>
     <w:p>
       <w:pPr>
@@ -7669,67 +8738,6 @@
             <wp:extent cx="5943600" cy="2324100"/>
             <wp:effectExtent t="0" r="0" b="0" l="0"/>
             <wp:docPr id="1" name="Figure 5. MD stability (50 ns): protein backbone RMSD (left) and ligand distance from the pocket (right); 10 A dashed line = bound/unbound threshold." descr="Figure 5. MD stability (50 ns): protein backbone RMSD (left) and ligand distance from the pocket (right); 10 A dashed line = bound/unbound threshold." title="Figure 5. MD stability (50 ns): protein backbone RMSD (left) and ligand distance from the pocket (right); 10 A dashed line = bound/unbound threshold."/>
-            <wp:cNvGraphicFramePr>
-              <a:graphicFrameLocks xmlns:a="http://schemas.openxmlformats.org/drawingml/2006/main" noChangeAspect="1"/>
-            </wp:cNvGraphicFramePr>
-            <a:graphic xmlns:a="http://schemas.openxmlformats.org/drawingml/2006/main">
-              <a:graphicData uri="http://schemas.openxmlformats.org/drawingml/2006/picture">
-                <pic:pic xmlns:pic="http://schemas.openxmlformats.org/drawingml/2006/picture">
-                  <pic:nvPicPr>
-                    <pic:cNvPr id="0" name="" descr=""/>
-                    <pic:cNvPicPr>
-                      <a:picLocks noChangeAspect="1" noChangeArrowheads="1"/>
-                    </pic:cNvPicPr>
-                  </pic:nvPicPr>
-                  <pic:blipFill>
-                    <a:blip r:embed="rId13" cstate="none"/>
-                    <a:srcRect/>
-                    <a:stretch>
-                      <a:fillRect/>
-                    </a:stretch>
-                  </pic:blipFill>
-                  <pic:spPr bwMode="auto">
-                    <a:xfrm>
-                      <a:off x="0" y="0"/>
-                      <a:ext cx="5943600" cy="2324100"/>
-                    </a:xfrm>
-                    <a:prstGeom prst="rect">
-                      <a:avLst/>
-                    </a:prstGeom>
-                  </pic:spPr>
-                </pic:pic>
-              </a:graphicData>
-            </a:graphic>
-          </wp:inline>
-        </w:drawing>
-      </w:r>
-    </w:p>
-    <w:p>
-      <w:pPr>
-        <w:spacing w:after="200"/>
-        <w:jc w:val="center"/>
-      </w:pPr>
-      <w:r>
-        <w:rPr>
-          <w:i/>
-          <w:iCs/>
-          <w:sz w:val="18"/>
-          <w:szCs w:val="18"/>
-        </w:rPr>
-        <w:t xml:space="preserve">Figure 5. MD stability (50 ns): protein backbone RMSD (left) and ligand distance from the pocket (right); 10 A dashed line = bound/unbound threshold.</w:t>
-      </w:r>
-    </w:p>
-    <w:p>
-      <w:pPr>
-        <w:spacing w:after="60" w:before="120"/>
-        <w:jc w:val="center"/>
-      </w:pPr>
-      <w:r>
-        <w:drawing>
-          <wp:inline distT="0" distB="0" distL="0" distR="0">
-            <wp:extent cx="4095750" cy="2924175"/>
-            <wp:effectExtent t="0" r="0" b="0" l="0"/>
-            <wp:docPr id="1" name="Figure 6. ToxT residues contacting EPA and their persistence (% of production frames within 4 A)." descr="Figure 6. ToxT residues contacting EPA and their persistence (% of production frames within 4 A)." title="Figure 6. ToxT residues contacting EPA and their persistence (% of production frames within 4 A)."/>
             <wp:cNvGraphicFramePr>
               <a:graphicFrameLocks xmlns:a="http://schemas.openxmlformats.org/drawingml/2006/main" noChangeAspect="1"/>
             </wp:cNvGraphicFramePr>
@@ -7752,7 +8760,7 @@
                   <pic:spPr bwMode="auto">
                     <a:xfrm>
                       <a:off x="0" y="0"/>
-                      <a:ext cx="4095750" cy="2924175"/>
+                      <a:ext cx="5943600" cy="2324100"/>
                     </a:xfrm>
                     <a:prstGeom prst="rect">
                       <a:avLst/>
@@ -7777,24 +8785,7 @@
           <w:sz w:val="18"/>
           <w:szCs w:val="18"/>
         </w:rPr>
-        <w:t xml:space="preserve">Figure 6. ToxT residues contacting EPA and their persistence (% of production frames within 4 A).</w:t>
-      </w:r>
-    </w:p>
-    <w:p>
-      <w:pPr>
-        <w:pStyle w:val="Heading2"/>
-      </w:pPr>
-      <w:r>
-        <w:t xml:space="preserve">3.10 Structural basis of binding and control simulations</w:t>
-      </w:r>
-    </w:p>
-    <w:p>
-      <w:pPr>
-        <w:spacing w:after="120" w:line="276"/>
-        <w:jc w:val="both"/>
-      </w:pPr>
-      <w:r>
-        <w:t xml:space="preserve">The docked lipids occupy the internal fatty-acid pocket of the ToxT N-terminal domain - an aromatic cage (Tyr12, Tyr20, Phe22, Phe33, Phe69, Tyr266) and hydrophobic wall (Leu/Val/Ile/Met) closed by a basic clamp (Lys31, Lys230, Arg13) that engages the carboxylate head group (Figure 8). Superposition of the full CV and CCM panels shows every lipid converges on this single pocket (Figure 9).</w:t>
+        <w:t xml:space="preserve">Figure 5. MD stability (50 ns): protein backbone RMSD (left) and ligand distance from the pocket (right); 10 A dashed line = bound/unbound threshold.</w:t>
       </w:r>
     </w:p>
     <w:p>
@@ -7805,9 +8796,9 @@
       <w:r>
         <w:drawing>
           <wp:inline distT="0" distB="0" distL="0" distR="0">
-            <wp:extent cx="5943600" cy="2971800"/>
+            <wp:extent cx="4095750" cy="2924175"/>
             <wp:effectExtent t="0" r="0" b="0" l="0"/>
-            <wp:docPr id="1" name="Figure 8. ToxT fatty-acid pocket. (A) Whole protein with the pocket highlighted; (B) pocket detail with residues coloured by chemistry (orange aromatic, blue basic, grey hydrophobic) and the native ligand (yellow); dashes mark salt bridges to the carboxylate." descr="Figure 8. ToxT fatty-acid pocket. (A) Whole protein with the pocket highlighted; (B) pocket detail with residues coloured by chemistry (orange aromatic, blue basic, grey hydrophobic) and the native ligand (yellow); dashes mark salt bridges to the carboxylate." title="Figure 8. ToxT fatty-acid pocket. (A) Whole protein with the pocket highlighted; (B) pocket detail with residues coloured by chemistry (orange aromatic, blue basic, grey hydrophobic) and the native ligand (yellow); dashes mark salt bridges to the carboxylate."/>
+            <wp:docPr id="1" name="Figure 6. ToxT residues contacting EPA and their persistence (% of production frames within 4 A)." descr="Figure 6. ToxT residues contacting EPA and their persistence (% of production frames within 4 A)." title="Figure 6. ToxT residues contacting EPA and their persistence (% of production frames within 4 A)."/>
             <wp:cNvGraphicFramePr>
               <a:graphicFrameLocks xmlns:a="http://schemas.openxmlformats.org/drawingml/2006/main" noChangeAspect="1"/>
             </wp:cNvGraphicFramePr>
@@ -7830,7 +8821,7 @@
                   <pic:spPr bwMode="auto">
                     <a:xfrm>
                       <a:off x="0" y="0"/>
-                      <a:ext cx="5943600" cy="2971800"/>
+                      <a:ext cx="4095750" cy="2924175"/>
                     </a:xfrm>
                     <a:prstGeom prst="rect">
                       <a:avLst/>
@@ -7855,7 +8846,24 @@
           <w:sz w:val="18"/>
           <w:szCs w:val="18"/>
         </w:rPr>
-        <w:t xml:space="preserve">Figure 8. ToxT fatty-acid pocket. (A) Whole protein with the pocket highlighted; (B) pocket detail with residues coloured by chemistry (orange aromatic, blue basic, grey hydrophobic) and the native ligand (yellow); dashes mark salt bridges to the carboxylate.</w:t>
+        <w:t xml:space="preserve">Figure 6. ToxT residues contacting EPA and their persistence (% of production frames within 4 A).</w:t>
+      </w:r>
+    </w:p>
+    <w:p>
+      <w:pPr>
+        <w:pStyle w:val="Heading2"/>
+      </w:pPr>
+      <w:r>
+        <w:t xml:space="preserve">3.10 Structural basis of binding and control simulations</w:t>
+      </w:r>
+    </w:p>
+    <w:p>
+      <w:pPr>
+        <w:spacing w:after="120" w:line="276"/>
+        <w:jc w:val="both"/>
+      </w:pPr>
+      <w:r>
+        <w:t xml:space="preserve">The docked lipids occupy the internal fatty-acid pocket of the ToxT N-terminal domain - an aromatic cage (Tyr12, Tyr20, Phe22, Phe33, Phe69, Tyr266) and hydrophobic wall (Leu/Val/Ile/Met) closed by a basic clamp (Lys31, Lys230, Arg13) that engages the carboxylate head group (Figure 8). Superposition of the full CV and CCM panels shows every lipid converges on this single pocket (Figure 9).</w:t>
       </w:r>
     </w:p>
     <w:p>
@@ -7866,9 +8874,9 @@
       <w:r>
         <w:drawing>
           <wp:inline distT="0" distB="0" distL="0" distR="0">
-            <wp:extent cx="3429000" cy="2857500"/>
+            <wp:extent cx="5943600" cy="2971800"/>
             <wp:effectExtent t="0" r="0" b="0" l="0"/>
-            <wp:docPr id="1" name="Figure 9A. All 15 CV lipids docked in the ToxT pocket, coloured by binding affinity." descr="Figure 9A. All 15 CV lipids docked in the ToxT pocket, coloured by binding affinity." title="Figure 9A. All 15 CV lipids docked in the ToxT pocket, coloured by binding affinity."/>
+            <wp:docPr id="1" name="Figure 8. ToxT fatty-acid pocket. (A) Whole protein with the pocket highlighted; (B) pocket detail with residues coloured by chemistry (orange aromatic, blue basic, grey hydrophobic) and the native ligand (yellow); dashes mark salt bridges to the carboxylate." descr="Figure 8. ToxT fatty-acid pocket. (A) Whole protein with the pocket highlighted; (B) pocket detail with residues coloured by chemistry (orange aromatic, blue basic, grey hydrophobic) and the native ligand (yellow); dashes mark salt bridges to the carboxylate." title="Figure 8. ToxT fatty-acid pocket. (A) Whole protein with the pocket highlighted; (B) pocket detail with residues coloured by chemistry (orange aromatic, blue basic, grey hydrophobic) and the native ligand (yellow); dashes mark salt bridges to the carboxylate."/>
             <wp:cNvGraphicFramePr>
               <a:graphicFrameLocks xmlns:a="http://schemas.openxmlformats.org/drawingml/2006/main" noChangeAspect="1"/>
             </wp:cNvGraphicFramePr>
@@ -7891,7 +8899,7 @@
                   <pic:spPr bwMode="auto">
                     <a:xfrm>
                       <a:off x="0" y="0"/>
-                      <a:ext cx="3429000" cy="2857500"/>
+                      <a:ext cx="5943600" cy="2971800"/>
                     </a:xfrm>
                     <a:prstGeom prst="rect">
                       <a:avLst/>
@@ -7916,7 +8924,7 @@
           <w:sz w:val="18"/>
           <w:szCs w:val="18"/>
         </w:rPr>
-        <w:t xml:space="preserve">Figure 9A. All 15 CV lipids docked in the ToxT pocket, coloured by binding affinity.</w:t>
+        <w:t xml:space="preserve">Figure 8. ToxT fatty-acid pocket. (A) Whole protein with the pocket highlighted; (B) pocket detail with residues coloured by chemistry (orange aromatic, blue basic, grey hydrophobic) and the native ligand (yellow); dashes mark salt bridges to the carboxylate.</w:t>
       </w:r>
     </w:p>
     <w:p>
@@ -7929,7 +8937,7 @@
           <wp:inline distT="0" distB="0" distL="0" distR="0">
             <wp:extent cx="3429000" cy="2857500"/>
             <wp:effectExtent t="0" r="0" b="0" l="0"/>
-            <wp:docPr id="1" name="Figure 9B. All 13 CCM lipids docked in the ToxT pocket, coloured by binding affinity." descr="Figure 9B. All 13 CCM lipids docked in the ToxT pocket, coloured by binding affinity." title="Figure 9B. All 13 CCM lipids docked in the ToxT pocket, coloured by binding affinity."/>
+            <wp:docPr id="1" name="Figure 9A. All 15 CV lipids docked in the ToxT pocket, coloured by binding affinity." descr="Figure 9A. All 15 CV lipids docked in the ToxT pocket, coloured by binding affinity." title="Figure 9A. All 15 CV lipids docked in the ToxT pocket, coloured by binding affinity."/>
             <wp:cNvGraphicFramePr>
               <a:graphicFrameLocks xmlns:a="http://schemas.openxmlformats.org/drawingml/2006/main" noChangeAspect="1"/>
             </wp:cNvGraphicFramePr>
@@ -7977,6 +8985,67 @@
           <w:sz w:val="18"/>
           <w:szCs w:val="18"/>
         </w:rPr>
+        <w:t xml:space="preserve">Figure 9A. All 15 CV lipids docked in the ToxT pocket, coloured by binding affinity.</w:t>
+      </w:r>
+    </w:p>
+    <w:p>
+      <w:pPr>
+        <w:spacing w:after="60" w:before="120"/>
+        <w:jc w:val="center"/>
+      </w:pPr>
+      <w:r>
+        <w:drawing>
+          <wp:inline distT="0" distB="0" distL="0" distR="0">
+            <wp:extent cx="3429000" cy="2857500"/>
+            <wp:effectExtent t="0" r="0" b="0" l="0"/>
+            <wp:docPr id="1" name="Figure 9B. All 13 CCM lipids docked in the ToxT pocket, coloured by binding affinity." descr="Figure 9B. All 13 CCM lipids docked in the ToxT pocket, coloured by binding affinity." title="Figure 9B. All 13 CCM lipids docked in the ToxT pocket, coloured by binding affinity."/>
+            <wp:cNvGraphicFramePr>
+              <a:graphicFrameLocks xmlns:a="http://schemas.openxmlformats.org/drawingml/2006/main" noChangeAspect="1"/>
+            </wp:cNvGraphicFramePr>
+            <a:graphic xmlns:a="http://schemas.openxmlformats.org/drawingml/2006/main">
+              <a:graphicData uri="http://schemas.openxmlformats.org/drawingml/2006/picture">
+                <pic:pic xmlns:pic="http://schemas.openxmlformats.org/drawingml/2006/picture">
+                  <pic:nvPicPr>
+                    <pic:cNvPr id="0" name="" descr=""/>
+                    <pic:cNvPicPr>
+                      <a:picLocks noChangeAspect="1" noChangeArrowheads="1"/>
+                    </pic:cNvPicPr>
+                  </pic:nvPicPr>
+                  <pic:blipFill>
+                    <a:blip r:embed="rId18" cstate="none"/>
+                    <a:srcRect/>
+                    <a:stretch>
+                      <a:fillRect/>
+                    </a:stretch>
+                  </pic:blipFill>
+                  <pic:spPr bwMode="auto">
+                    <a:xfrm>
+                      <a:off x="0" y="0"/>
+                      <a:ext cx="3429000" cy="2857500"/>
+                    </a:xfrm>
+                    <a:prstGeom prst="rect">
+                      <a:avLst/>
+                    </a:prstGeom>
+                  </pic:spPr>
+                </pic:pic>
+              </a:graphicData>
+            </a:graphic>
+          </wp:inline>
+        </w:drawing>
+      </w:r>
+    </w:p>
+    <w:p>
+      <w:pPr>
+        <w:spacing w:after="200"/>
+        <w:jc w:val="center"/>
+      </w:pPr>
+      <w:r>
+        <w:rPr>
+          <w:i/>
+          <w:iCs/>
+          <w:sz w:val="18"/>
+          <w:szCs w:val="18"/>
+        </w:rPr>
         <w:t xml:space="preserve">Figure 9B. All 13 CCM lipids docked in the ToxT pocket, coloured by binding affinity.</w:t>
       </w:r>
     </w:p>
@@ -7986,7 +9055,7 @@
         <w:jc w:val="both"/>
       </w:pPr>
       <w:r>
-        <w:t xml:space="preserve">Three control simulations tested specificity (Table 7). Positive control: the native ligand palmitoleate remained bound throughout (ligand-pocket 1.5 A, 100% of frames), reproducing the crystallographic mode and validating the protocol. Negative control: a glucose decoy docked into the pocket was expelled to the pocket mouth (~8.9 A) and never occupied the core, whereas all fatty acids stayed 1-3 A from the pocket centre (Figure 10) - demonstrating the pocket is fatty-acid selective. The two weakest-docking lipids (pentadecanal, tridecanoic acid) nonetheless formed stable complexes once seated (1.7-2.0 A, 100% bound); thus all cognate lipids are retained, and affinity differences among lipids manifest as reduced pocket-selectivity in blind docking (Section 3.9) rather than reduced MD stability. An apo (ligand-free) run provided a dynamics baseline.</w:t>
+        <w:t xml:space="preserve">Specificity was assessed by both binding preference and dynamics (Table 7). Positive control: the native ligand palmitoleate remained bound throughout (1.5 A, 100% of frames), validating the protocol. Negative control - binding preference (the primary discriminator): in blind docking over the entire protein the glucose decoy never localised to the fatty-acid pocket (0 of 20 poses; best pose 17 A away on the surface) and bound weakly (-5.5 kcal/mol; Table 6), in stark contrast to the fatty acids (8-15 of 15 poses in the pocket) and consistent with glucose giving the least favourable MM-GBSA energy. Negative control - dynamics: two 50 ns glucose simulations differed by starting pose - from its peripheral docked pose glucose stayed at the pocket mouth (~8.9 A), whereas when artificially seeded in the pocket core it was retained (~2.5 A) for the whole trajectory (Figure 10). This retention reflects kinetic trapping in a buried internal cavity, not favourable binding, and underscores that pocket preference (blind docking and energetics), not MD retention, discriminates cognate lipids from the decoy. Consistent with this, the two weakest-docking cognate lipids (pentadecanal, tridecanoic) also formed stable complexes once seated (1.7-2.0 A). An apo run provided a baseline.</w:t>
       </w:r>
     </w:p>
     <w:p>
@@ -8285,7 +9354,7 @@
                 <w:sz w:val="19"/>
                 <w:szCs w:val="19"/>
               </w:rPr>
-              <w:t xml:space="preserve">glucose</w:t>
+              <w:t xml:space="preserve">glucose - docked (peripheral) start</w:t>
             </w:r>
           </w:p>
         </w:tc>
@@ -8369,7 +9438,121 @@
                 <w:sz w:val="19"/>
                 <w:szCs w:val="19"/>
               </w:rPr>
-              <w:t xml:space="preserve">expelled</w:t>
+              <w:t xml:space="preserve">stays at pocket mouth</w:t>
+            </w:r>
+          </w:p>
+        </w:tc>
+      </w:tr>
+      <w:tr>
+        <w:tc>
+          <w:tcPr>
+            <w:tcW w:type="dxa" w:w="2760"/>
+            <w:tcBorders>
+              <w:top w:val="single" w:color="BBBBBB" w:sz="1"/>
+              <w:left w:val="single" w:color="BBBBBB" w:sz="1"/>
+              <w:bottom w:val="single" w:color="BBBBBB" w:sz="1"/>
+              <w:right w:val="single" w:color="BBBBBB" w:sz="1"/>
+            </w:tcBorders>
+            <w:tcMar>
+              <w:top w:type="dxa" w:w="60"/>
+              <w:left w:type="dxa" w:w="100"/>
+              <w:bottom w:type="dxa" w:w="60"/>
+              <w:right w:type="dxa" w:w="100"/>
+            </w:tcMar>
+          </w:tcPr>
+          <w:p>
+            <w:r>
+              <w:rPr>
+                <w:b w:val="false"/>
+                <w:bCs w:val="false"/>
+                <w:sz w:val="19"/>
+                <w:szCs w:val="19"/>
+              </w:rPr>
+              <w:t xml:space="preserve">glucose - seeded in pocket core</w:t>
+            </w:r>
+          </w:p>
+        </w:tc>
+        <w:tc>
+          <w:tcPr>
+            <w:tcW w:type="dxa" w:w="2900"/>
+            <w:tcBorders>
+              <w:top w:val="single" w:color="BBBBBB" w:sz="1"/>
+              <w:left w:val="single" w:color="BBBBBB" w:sz="1"/>
+              <w:bottom w:val="single" w:color="BBBBBB" w:sz="1"/>
+              <w:right w:val="single" w:color="BBBBBB" w:sz="1"/>
+            </w:tcBorders>
+            <w:tcMar>
+              <w:top w:type="dxa" w:w="60"/>
+              <w:left w:type="dxa" w:w="100"/>
+              <w:bottom w:type="dxa" w:w="60"/>
+              <w:right w:type="dxa" w:w="100"/>
+            </w:tcMar>
+          </w:tcPr>
+          <w:p>
+            <w:r>
+              <w:rPr>
+                <w:b w:val="false"/>
+                <w:bCs w:val="false"/>
+                <w:sz w:val="19"/>
+                <w:szCs w:val="19"/>
+              </w:rPr>
+              <w:t xml:space="preserve">negative control (decoy)</w:t>
+            </w:r>
+          </w:p>
+        </w:tc>
+        <w:tc>
+          <w:tcPr>
+            <w:tcW w:type="dxa" w:w="2200"/>
+            <w:tcBorders>
+              <w:top w:val="single" w:color="BBBBBB" w:sz="1"/>
+              <w:left w:val="single" w:color="BBBBBB" w:sz="1"/>
+              <w:bottom w:val="single" w:color="BBBBBB" w:sz="1"/>
+              <w:right w:val="single" w:color="BBBBBB" w:sz="1"/>
+            </w:tcBorders>
+            <w:tcMar>
+              <w:top w:type="dxa" w:w="60"/>
+              <w:left w:type="dxa" w:w="100"/>
+              <w:bottom w:type="dxa" w:w="60"/>
+              <w:right w:type="dxa" w:w="100"/>
+            </w:tcMar>
+          </w:tcPr>
+          <w:p>
+            <w:r>
+              <w:rPr>
+                <w:b w:val="false"/>
+                <w:bCs w:val="false"/>
+                <w:sz w:val="19"/>
+                <w:szCs w:val="19"/>
+              </w:rPr>
+              <w:t xml:space="preserve">2.5</w:t>
+            </w:r>
+          </w:p>
+        </w:tc>
+        <w:tc>
+          <w:tcPr>
+            <w:tcW w:type="dxa" w:w="1500"/>
+            <w:tcBorders>
+              <w:top w:val="single" w:color="BBBBBB" w:sz="1"/>
+              <w:left w:val="single" w:color="BBBBBB" w:sz="1"/>
+              <w:bottom w:val="single" w:color="BBBBBB" w:sz="1"/>
+              <w:right w:val="single" w:color="BBBBBB" w:sz="1"/>
+            </w:tcBorders>
+            <w:tcMar>
+              <w:top w:type="dxa" w:w="60"/>
+              <w:left w:type="dxa" w:w="100"/>
+              <w:bottom w:type="dxa" w:w="60"/>
+              <w:right w:type="dxa" w:w="100"/>
+            </w:tcMar>
+          </w:tcPr>
+          <w:p>
+            <w:r>
+              <w:rPr>
+                <w:b w:val="false"/>
+                <w:bCs w:val="false"/>
+                <w:sz w:val="19"/>
+                <w:szCs w:val="19"/>
+              </w:rPr>
+              <w:t xml:space="preserve">retained (buried-cavity trapping)</w:t>
             </w:r>
           </w:p>
         </w:tc>
@@ -8727,573 +9910,7 @@
           <wp:inline distT="0" distB="0" distL="0" distR="0">
             <wp:extent cx="5715000" cy="3305175"/>
             <wp:effectExtent t="0" r="0" b="0" l="0"/>
-            <wp:docPr id="1" name="Figure 10. Ligand-pocket distance over 50 ns: cognate fatty acids and the native ligand stay in the pocket core (green band), while the glucose decoy is held at the pocket mouth (~9 A)." descr="Figure 10. Ligand-pocket distance over 50 ns: cognate fatty acids and the native ligand stay in the pocket core (green band), while the glucose decoy is held at the pocket mouth (~9 A)." title="Figure 10. Ligand-pocket distance over 50 ns: cognate fatty acids and the native ligand stay in the pocket core (green band), while the glucose decoy is held at the pocket mouth (~9 A)."/>
-            <wp:cNvGraphicFramePr>
-              <a:graphicFrameLocks xmlns:a="http://schemas.openxmlformats.org/drawingml/2006/main" noChangeAspect="1"/>
-            </wp:cNvGraphicFramePr>
-            <a:graphic xmlns:a="http://schemas.openxmlformats.org/drawingml/2006/main">
-              <a:graphicData uri="http://schemas.openxmlformats.org/drawingml/2006/picture">
-                <pic:pic xmlns:pic="http://schemas.openxmlformats.org/drawingml/2006/picture">
-                  <pic:nvPicPr>
-                    <pic:cNvPr id="0" name="" descr=""/>
-                    <pic:cNvPicPr>
-                      <a:picLocks noChangeAspect="1" noChangeArrowheads="1"/>
-                    </pic:cNvPicPr>
-                  </pic:nvPicPr>
-                  <pic:blipFill>
-                    <a:blip r:embed="rId18" cstate="none"/>
-                    <a:srcRect/>
-                    <a:stretch>
-                      <a:fillRect/>
-                    </a:stretch>
-                  </pic:blipFill>
-                  <pic:spPr bwMode="auto">
-                    <a:xfrm>
-                      <a:off x="0" y="0"/>
-                      <a:ext cx="5715000" cy="3305175"/>
-                    </a:xfrm>
-                    <a:prstGeom prst="rect">
-                      <a:avLst/>
-                    </a:prstGeom>
-                  </pic:spPr>
-                </pic:pic>
-              </a:graphicData>
-            </a:graphic>
-          </wp:inline>
-        </w:drawing>
-      </w:r>
-    </w:p>
-    <w:p>
-      <w:pPr>
-        <w:spacing w:after="200"/>
-        <w:jc w:val="center"/>
-      </w:pPr>
-      <w:r>
-        <w:rPr>
-          <w:i/>
-          <w:iCs/>
-          <w:sz w:val="18"/>
-          <w:szCs w:val="18"/>
-        </w:rPr>
-        <w:t xml:space="preserve">Figure 10. Ligand-pocket distance over 50 ns: cognate fatty acids and the native ligand stay in the pocket core (green band), while the glucose decoy is held at the pocket mouth (~9 A).</w:t>
-      </w:r>
-    </w:p>
-    <w:p>
-      <w:pPr>
-        <w:pStyle w:val="Heading2"/>
-      </w:pPr>
-      <w:r>
-        <w:t xml:space="preserve">3.11 Comparison with known ToxT ligands</w:t>
-      </w:r>
-    </w:p>
-    <w:p>
-      <w:pPr>
-        <w:spacing w:after="120" w:line="276"/>
-        <w:jc w:val="both"/>
-      </w:pPr>
-      <w:r>
-        <w:t xml:space="preserve">Prior computational studies of ToxT ligands used heterogeneous programs and score units (e.g. GOLD fitness scores; MM interaction energies in kJ/mol) that are not directly comparable across methods. To place the algal lipids on a single comparable footing, three reference ToxT ligands were docked under the identical protocol (same box, seed and Vina 1.2.7 scoring): the engineered inhibitor virstatin, the short-chain fatty acid butyrate (a recently reported natural ToxT-targeting compound), and oleic acid (a native-type unsaturated fatty acid). The algal lipids (-6.8 to -8.8 kcal/mol) bound comparably to oleic acid (-7.90) and substantially more strongly than butyrate (-3.71). The purpose-designed inhibitor virstatin scored highest (-10.21), as expected for an engineered scaffold - a value that also partly reflects the docking score's known dependence on aromatic surface area, and virstatin's mechanism (interference with ToxT dimerisation) differs from direct pocket occupancy. Thus these microalgae supply naturally occurring ToxT-pocket binders that engage the site as effectively as its native regulator, without any medicinal-chemistry optimisation (Table 8).</w:t>
-      </w:r>
-    </w:p>
-    <w:p>
-      <w:pPr>
-        <w:spacing w:after="120" w:line="276"/>
-      </w:pPr>
-      <w:r>
-        <w:rPr>
-          <w:b/>
-          <w:bCs/>
-          <w:sz w:val="19"/>
-          <w:szCs w:val="19"/>
-        </w:rPr>
-        <w:t xml:space="preserve">Table 8. Reference ToxT ligands docked under the identical protocol.</w:t>
-      </w:r>
-    </w:p>
-    <w:tbl>
-      <w:tblPr>
-        <w:tblW w:type="dxa" w:w="9360"/>
-        <w:tblBorders>
-          <w:top w:val="single" w:color="auto" w:sz="4"/>
-          <w:left w:val="single" w:color="auto" w:sz="4"/>
-          <w:bottom w:val="single" w:color="auto" w:sz="4"/>
-          <w:right w:val="single" w:color="auto" w:sz="4"/>
-          <w:insideH w:val="single" w:color="auto" w:sz="4"/>
-          <w:insideV w:val="single" w:color="auto" w:sz="4"/>
-        </w:tblBorders>
-      </w:tblPr>
-      <w:tblGrid>
-        <w:gridCol w:w="3060"/>
-        <w:gridCol w:w="2400"/>
-        <w:gridCol w:w="3900"/>
-      </w:tblGrid>
-      <w:tr>
-        <w:trPr>
-          <w:tblHeader/>
-        </w:trPr>
-        <w:tc>
-          <w:tcPr>
-            <w:tcW w:type="dxa" w:w="3060"/>
-            <w:tcBorders>
-              <w:top w:val="single" w:color="BBBBBB" w:sz="1"/>
-              <w:left w:val="single" w:color="BBBBBB" w:sz="1"/>
-              <w:bottom w:val="single" w:color="BBBBBB" w:sz="1"/>
-              <w:right w:val="single" w:color="BBBBBB" w:sz="1"/>
-            </w:tcBorders>
-            <w:shd w:fill="1F4E79" w:val="clear"/>
-            <w:tcMar>
-              <w:top w:type="dxa" w:w="60"/>
-              <w:left w:type="dxa" w:w="100"/>
-              <w:bottom w:type="dxa" w:w="60"/>
-              <w:right w:type="dxa" w:w="100"/>
-            </w:tcMar>
-          </w:tcPr>
-          <w:p>
-            <w:r>
-              <w:rPr>
-                <w:b/>
-                <w:bCs/>
-                <w:color w:val="FFFFFF"/>
-                <w:sz w:val="19"/>
-                <w:szCs w:val="19"/>
-              </w:rPr>
-              <w:t xml:space="preserve">Compound</w:t>
-            </w:r>
-          </w:p>
-        </w:tc>
-        <w:tc>
-          <w:tcPr>
-            <w:tcW w:type="dxa" w:w="2400"/>
-            <w:tcBorders>
-              <w:top w:val="single" w:color="BBBBBB" w:sz="1"/>
-              <w:left w:val="single" w:color="BBBBBB" w:sz="1"/>
-              <w:bottom w:val="single" w:color="BBBBBB" w:sz="1"/>
-              <w:right w:val="single" w:color="BBBBBB" w:sz="1"/>
-            </w:tcBorders>
-            <w:shd w:fill="1F4E79" w:val="clear"/>
-            <w:tcMar>
-              <w:top w:type="dxa" w:w="60"/>
-              <w:left w:type="dxa" w:w="100"/>
-              <w:bottom w:type="dxa" w:w="60"/>
-              <w:right w:type="dxa" w:w="100"/>
-            </w:tcMar>
-          </w:tcPr>
-          <w:p>
-            <w:r>
-              <w:rPr>
-                <w:b/>
-                <w:bCs/>
-                <w:color w:val="FFFFFF"/>
-                <w:sz w:val="19"/>
-                <w:szCs w:val="19"/>
-              </w:rPr>
-              <w:t xml:space="preserve">dG (kcal/mol)</w:t>
-            </w:r>
-          </w:p>
-        </w:tc>
-        <w:tc>
-          <w:tcPr>
-            <w:tcW w:type="dxa" w:w="3900"/>
-            <w:tcBorders>
-              <w:top w:val="single" w:color="BBBBBB" w:sz="1"/>
-              <w:left w:val="single" w:color="BBBBBB" w:sz="1"/>
-              <w:bottom w:val="single" w:color="BBBBBB" w:sz="1"/>
-              <w:right w:val="single" w:color="BBBBBB" w:sz="1"/>
-            </w:tcBorders>
-            <w:shd w:fill="1F4E79" w:val="clear"/>
-            <w:tcMar>
-              <w:top w:type="dxa" w:w="60"/>
-              <w:left w:type="dxa" w:w="100"/>
-              <w:bottom w:type="dxa" w:w="60"/>
-              <w:right w:type="dxa" w:w="100"/>
-            </w:tcMar>
-          </w:tcPr>
-          <w:p>
-            <w:r>
-              <w:rPr>
-                <w:b/>
-                <w:bCs/>
-                <w:color w:val="FFFFFF"/>
-                <w:sz w:val="19"/>
-                <w:szCs w:val="19"/>
-              </w:rPr>
-              <w:t xml:space="preserve">Type</w:t>
-            </w:r>
-          </w:p>
-        </w:tc>
-      </w:tr>
-      <w:tr>
-        <w:tc>
-          <w:tcPr>
-            <w:tcW w:type="dxa" w:w="3060"/>
-            <w:tcBorders>
-              <w:top w:val="single" w:color="BBBBBB" w:sz="1"/>
-              <w:left w:val="single" w:color="BBBBBB" w:sz="1"/>
-              <w:bottom w:val="single" w:color="BBBBBB" w:sz="1"/>
-              <w:right w:val="single" w:color="BBBBBB" w:sz="1"/>
-            </w:tcBorders>
-            <w:tcMar>
-              <w:top w:type="dxa" w:w="60"/>
-              <w:left w:type="dxa" w:w="100"/>
-              <w:bottom w:type="dxa" w:w="60"/>
-              <w:right w:type="dxa" w:w="100"/>
-            </w:tcMar>
-          </w:tcPr>
-          <w:p>
-            <w:r>
-              <w:rPr>
-                <w:b w:val="false"/>
-                <w:bCs w:val="false"/>
-                <w:sz w:val="19"/>
-                <w:szCs w:val="19"/>
-              </w:rPr>
-              <w:t xml:space="preserve">virstatin</w:t>
-            </w:r>
-          </w:p>
-        </w:tc>
-        <w:tc>
-          <w:tcPr>
-            <w:tcW w:type="dxa" w:w="2400"/>
-            <w:tcBorders>
-              <w:top w:val="single" w:color="BBBBBB" w:sz="1"/>
-              <w:left w:val="single" w:color="BBBBBB" w:sz="1"/>
-              <w:bottom w:val="single" w:color="BBBBBB" w:sz="1"/>
-              <w:right w:val="single" w:color="BBBBBB" w:sz="1"/>
-            </w:tcBorders>
-            <w:tcMar>
-              <w:top w:type="dxa" w:w="60"/>
-              <w:left w:type="dxa" w:w="100"/>
-              <w:bottom w:type="dxa" w:w="60"/>
-              <w:right w:type="dxa" w:w="100"/>
-            </w:tcMar>
-          </w:tcPr>
-          <w:p>
-            <w:r>
-              <w:rPr>
-                <w:b w:val="false"/>
-                <w:bCs w:val="false"/>
-                <w:sz w:val="19"/>
-                <w:szCs w:val="19"/>
-              </w:rPr>
-              <w:t xml:space="preserve">-10.21</w:t>
-            </w:r>
-          </w:p>
-        </w:tc>
-        <w:tc>
-          <w:tcPr>
-            <w:tcW w:type="dxa" w:w="3900"/>
-            <w:tcBorders>
-              <w:top w:val="single" w:color="BBBBBB" w:sz="1"/>
-              <w:left w:val="single" w:color="BBBBBB" w:sz="1"/>
-              <w:bottom w:val="single" w:color="BBBBBB" w:sz="1"/>
-              <w:right w:val="single" w:color="BBBBBB" w:sz="1"/>
-            </w:tcBorders>
-            <w:tcMar>
-              <w:top w:type="dxa" w:w="60"/>
-              <w:left w:type="dxa" w:w="100"/>
-              <w:bottom w:type="dxa" w:w="60"/>
-              <w:right w:type="dxa" w:w="100"/>
-            </w:tcMar>
-          </w:tcPr>
-          <w:p>
-            <w:r>
-              <w:rPr>
-                <w:b w:val="false"/>
-                <w:bCs w:val="false"/>
-                <w:sz w:val="19"/>
-                <w:szCs w:val="19"/>
-              </w:rPr>
-              <w:t xml:space="preserve">synthetic, engineered inhibitor</w:t>
-            </w:r>
-          </w:p>
-        </w:tc>
-      </w:tr>
-      <w:tr>
-        <w:tc>
-          <w:tcPr>
-            <w:tcW w:type="dxa" w:w="3060"/>
-            <w:tcBorders>
-              <w:top w:val="single" w:color="BBBBBB" w:sz="1"/>
-              <w:left w:val="single" w:color="BBBBBB" w:sz="1"/>
-              <w:bottom w:val="single" w:color="BBBBBB" w:sz="1"/>
-              <w:right w:val="single" w:color="BBBBBB" w:sz="1"/>
-            </w:tcBorders>
-            <w:tcMar>
-              <w:top w:type="dxa" w:w="60"/>
-              <w:left w:type="dxa" w:w="100"/>
-              <w:bottom w:type="dxa" w:w="60"/>
-              <w:right w:type="dxa" w:w="100"/>
-            </w:tcMar>
-          </w:tcPr>
-          <w:p>
-            <w:r>
-              <w:rPr>
-                <w:b w:val="false"/>
-                <w:bCs w:val="false"/>
-                <w:sz w:val="19"/>
-                <w:szCs w:val="19"/>
-              </w:rPr>
-              <w:t xml:space="preserve">algal lipids (this study)</w:t>
-            </w:r>
-          </w:p>
-        </w:tc>
-        <w:tc>
-          <w:tcPr>
-            <w:tcW w:type="dxa" w:w="2400"/>
-            <w:tcBorders>
-              <w:top w:val="single" w:color="BBBBBB" w:sz="1"/>
-              <w:left w:val="single" w:color="BBBBBB" w:sz="1"/>
-              <w:bottom w:val="single" w:color="BBBBBB" w:sz="1"/>
-              <w:right w:val="single" w:color="BBBBBB" w:sz="1"/>
-            </w:tcBorders>
-            <w:tcMar>
-              <w:top w:type="dxa" w:w="60"/>
-              <w:left w:type="dxa" w:w="100"/>
-              <w:bottom w:type="dxa" w:w="60"/>
-              <w:right w:type="dxa" w:w="100"/>
-            </w:tcMar>
-          </w:tcPr>
-          <w:p>
-            <w:r>
-              <w:rPr>
-                <w:b w:val="false"/>
-                <w:bCs w:val="false"/>
-                <w:sz w:val="19"/>
-                <w:szCs w:val="19"/>
-              </w:rPr>
-              <w:t xml:space="preserve">-6.8 to -8.8</w:t>
-            </w:r>
-          </w:p>
-        </w:tc>
-        <w:tc>
-          <w:tcPr>
-            <w:tcW w:type="dxa" w:w="3900"/>
-            <w:tcBorders>
-              <w:top w:val="single" w:color="BBBBBB" w:sz="1"/>
-              <w:left w:val="single" w:color="BBBBBB" w:sz="1"/>
-              <w:bottom w:val="single" w:color="BBBBBB" w:sz="1"/>
-              <w:right w:val="single" w:color="BBBBBB" w:sz="1"/>
-            </w:tcBorders>
-            <w:tcMar>
-              <w:top w:type="dxa" w:w="60"/>
-              <w:left w:type="dxa" w:w="100"/>
-              <w:bottom w:type="dxa" w:w="60"/>
-              <w:right w:type="dxa" w:w="100"/>
-            </w:tcMar>
-          </w:tcPr>
-          <w:p>
-            <w:r>
-              <w:rPr>
-                <w:b w:val="false"/>
-                <w:bCs w:val="false"/>
-                <w:sz w:val="19"/>
-                <w:szCs w:val="19"/>
-              </w:rPr>
-              <w:t xml:space="preserve">natural (microalgal)</w:t>
-            </w:r>
-          </w:p>
-        </w:tc>
-      </w:tr>
-      <w:tr>
-        <w:tc>
-          <w:tcPr>
-            <w:tcW w:type="dxa" w:w="3060"/>
-            <w:tcBorders>
-              <w:top w:val="single" w:color="BBBBBB" w:sz="1"/>
-              <w:left w:val="single" w:color="BBBBBB" w:sz="1"/>
-              <w:bottom w:val="single" w:color="BBBBBB" w:sz="1"/>
-              <w:right w:val="single" w:color="BBBBBB" w:sz="1"/>
-            </w:tcBorders>
-            <w:tcMar>
-              <w:top w:type="dxa" w:w="60"/>
-              <w:left w:type="dxa" w:w="100"/>
-              <w:bottom w:type="dxa" w:w="60"/>
-              <w:right w:type="dxa" w:w="100"/>
-            </w:tcMar>
-          </w:tcPr>
-          <w:p>
-            <w:r>
-              <w:rPr>
-                <w:b w:val="false"/>
-                <w:bCs w:val="false"/>
-                <w:sz w:val="19"/>
-                <w:szCs w:val="19"/>
-              </w:rPr>
-              <w:t xml:space="preserve">oleic acid</w:t>
-            </w:r>
-          </w:p>
-        </w:tc>
-        <w:tc>
-          <w:tcPr>
-            <w:tcW w:type="dxa" w:w="2400"/>
-            <w:tcBorders>
-              <w:top w:val="single" w:color="BBBBBB" w:sz="1"/>
-              <w:left w:val="single" w:color="BBBBBB" w:sz="1"/>
-              <w:bottom w:val="single" w:color="BBBBBB" w:sz="1"/>
-              <w:right w:val="single" w:color="BBBBBB" w:sz="1"/>
-            </w:tcBorders>
-            <w:tcMar>
-              <w:top w:type="dxa" w:w="60"/>
-              <w:left w:type="dxa" w:w="100"/>
-              <w:bottom w:type="dxa" w:w="60"/>
-              <w:right w:type="dxa" w:w="100"/>
-            </w:tcMar>
-          </w:tcPr>
-          <w:p>
-            <w:r>
-              <w:rPr>
-                <w:b w:val="false"/>
-                <w:bCs w:val="false"/>
-                <w:sz w:val="19"/>
-                <w:szCs w:val="19"/>
-              </w:rPr>
-              <w:t xml:space="preserve">-7.90</w:t>
-            </w:r>
-          </w:p>
-        </w:tc>
-        <w:tc>
-          <w:tcPr>
-            <w:tcW w:type="dxa" w:w="3900"/>
-            <w:tcBorders>
-              <w:top w:val="single" w:color="BBBBBB" w:sz="1"/>
-              <w:left w:val="single" w:color="BBBBBB" w:sz="1"/>
-              <w:bottom w:val="single" w:color="BBBBBB" w:sz="1"/>
-              <w:right w:val="single" w:color="BBBBBB" w:sz="1"/>
-            </w:tcBorders>
-            <w:tcMar>
-              <w:top w:type="dxa" w:w="60"/>
-              <w:left w:type="dxa" w:w="100"/>
-              <w:bottom w:type="dxa" w:w="60"/>
-              <w:right w:type="dxa" w:w="100"/>
-            </w:tcMar>
-          </w:tcPr>
-          <w:p>
-            <w:r>
-              <w:rPr>
-                <w:b w:val="false"/>
-                <w:bCs w:val="false"/>
-                <w:sz w:val="19"/>
-                <w:szCs w:val="19"/>
-              </w:rPr>
-              <w:t xml:space="preserve">native-type unsaturated fatty acid</w:t>
-            </w:r>
-          </w:p>
-        </w:tc>
-      </w:tr>
-      <w:tr>
-        <w:tc>
-          <w:tcPr>
-            <w:tcW w:type="dxa" w:w="3060"/>
-            <w:tcBorders>
-              <w:top w:val="single" w:color="BBBBBB" w:sz="1"/>
-              <w:left w:val="single" w:color="BBBBBB" w:sz="1"/>
-              <w:bottom w:val="single" w:color="BBBBBB" w:sz="1"/>
-              <w:right w:val="single" w:color="BBBBBB" w:sz="1"/>
-            </w:tcBorders>
-            <w:tcMar>
-              <w:top w:type="dxa" w:w="60"/>
-              <w:left w:type="dxa" w:w="100"/>
-              <w:bottom w:type="dxa" w:w="60"/>
-              <w:right w:type="dxa" w:w="100"/>
-            </w:tcMar>
-          </w:tcPr>
-          <w:p>
-            <w:r>
-              <w:rPr>
-                <w:b w:val="false"/>
-                <w:bCs w:val="false"/>
-                <w:sz w:val="19"/>
-                <w:szCs w:val="19"/>
-              </w:rPr>
-              <w:t xml:space="preserve">butyric acid</w:t>
-            </w:r>
-          </w:p>
-        </w:tc>
-        <w:tc>
-          <w:tcPr>
-            <w:tcW w:type="dxa" w:w="2400"/>
-            <w:tcBorders>
-              <w:top w:val="single" w:color="BBBBBB" w:sz="1"/>
-              <w:left w:val="single" w:color="BBBBBB" w:sz="1"/>
-              <w:bottom w:val="single" w:color="BBBBBB" w:sz="1"/>
-              <w:right w:val="single" w:color="BBBBBB" w:sz="1"/>
-            </w:tcBorders>
-            <w:tcMar>
-              <w:top w:type="dxa" w:w="60"/>
-              <w:left w:type="dxa" w:w="100"/>
-              <w:bottom w:type="dxa" w:w="60"/>
-              <w:right w:type="dxa" w:w="100"/>
-            </w:tcMar>
-          </w:tcPr>
-          <w:p>
-            <w:r>
-              <w:rPr>
-                <w:b w:val="false"/>
-                <w:bCs w:val="false"/>
-                <w:sz w:val="19"/>
-                <w:szCs w:val="19"/>
-              </w:rPr>
-              <w:t xml:space="preserve">-3.71</w:t>
-            </w:r>
-          </w:p>
-        </w:tc>
-        <w:tc>
-          <w:tcPr>
-            <w:tcW w:type="dxa" w:w="3900"/>
-            <w:tcBorders>
-              <w:top w:val="single" w:color="BBBBBB" w:sz="1"/>
-              <w:left w:val="single" w:color="BBBBBB" w:sz="1"/>
-              <w:bottom w:val="single" w:color="BBBBBB" w:sz="1"/>
-              <w:right w:val="single" w:color="BBBBBB" w:sz="1"/>
-            </w:tcBorders>
-            <w:tcMar>
-              <w:top w:type="dxa" w:w="60"/>
-              <w:left w:type="dxa" w:w="100"/>
-              <w:bottom w:type="dxa" w:w="60"/>
-              <w:right w:type="dxa" w:w="100"/>
-            </w:tcMar>
-          </w:tcPr>
-          <w:p>
-            <w:r>
-              <w:rPr>
-                <w:b w:val="false"/>
-                <w:bCs w:val="false"/>
-                <w:sz w:val="19"/>
-                <w:szCs w:val="19"/>
-              </w:rPr>
-              <w:t xml:space="preserve">natural short-chain fatty acid</w:t>
-            </w:r>
-          </w:p>
-        </w:tc>
-      </w:tr>
-    </w:tbl>
-    <w:p>
-      <w:pPr>
-        <w:pStyle w:val="Heading2"/>
-      </w:pPr>
-      <w:r>
-        <w:t xml:space="preserve">3.12 A modelled ToxT-DNA complex indicates an allosteric mechanism</w:t>
-      </w:r>
-    </w:p>
-    <w:p>
-      <w:pPr>
-        <w:spacing w:after="120" w:line="276"/>
-        <w:jc w:val="both"/>
-      </w:pPr>
-      <w:r>
-        <w:t xml:space="preserve">To probe how fatty-acid binding translates into loss of virulence-gene activation, a ToxT-DNA complex was modelled with AlphaFold3 (full-length ToxT plus a 34-bp duplex bearing two direct-repeat toxbox elements). The ToxT fold was predicted with high confidence (pTM 0.85), whereas the protein-DNA interface was of modest confidence (ipTM 0.31); the model is therefore interpreted only at the domain level. The DNA was contacted exclusively by the C-terminal AraC-family helix-turn-helix domain (residues 188-276; e.g. Arg214, Lys235/237, Tyr250, Lys256), while the fatty-acid pocket lies in the N-terminal domain ~30 A away, making no direct contact with the DNA (nearest approach ~6 A; Figure 11). Because the regulatory pocket and the DNA-reading head are on distinct, spatially separated domains, fatty-acid occupancy cannot sterically block DNA binding; the architecture is instead consistent with an allosteric mechanism in which pocket occupancy restrains the inter-domain conformation required for productive DNA engagement - the closed-state model of Lowden et al. (2010). The algal lipids are thus predicted to switch off ToxT-dependent transcription by locking ToxT in a DNA-binding-incompetent conformation rather than by competing with DNA directly.</w:t>
-      </w:r>
-    </w:p>
-    <w:p>
-      <w:pPr>
-        <w:spacing w:after="60" w:before="120"/>
-        <w:jc w:val="center"/>
-      </w:pPr>
-      <w:r>
-        <w:drawing>
-          <wp:inline distT="0" distB="0" distL="0" distR="0">
-            <wp:extent cx="5715000" cy="4210050"/>
-            <wp:effectExtent t="0" r="0" b="0" l="0"/>
-            <wp:docPr id="1" name="Figure 11. AlphaFold3 model of the ToxT-DNA complex: toxbox DNA (teal), the C-terminal HTH DNA-binding domain (blue, residues 188-276), and the fatty-acid pocket (orange) with the native ligand (yellow, from 3GBG superposition) ~30 A away (red dashes) - supporting an allosteric mechanism. ToxT fold high-confidence (pTM 0.85); DNA pose low-confidence (ipTM 0.31), interpreted only at the domain level." descr="Figure 11. AlphaFold3 model of the ToxT-DNA complex: toxbox DNA (teal), the C-terminal HTH DNA-binding domain (blue, residues 188-276), and the fatty-acid pocket (orange) with the native ligand (yellow, from 3GBG superposition) ~30 A away (red dashes) - supporting an allosteric mechanism. ToxT fold high-confidence (pTM 0.85); DNA pose low-confidence (ipTM 0.31), interpreted only at the domain level." title="Figure 11. AlphaFold3 model of the ToxT-DNA complex: toxbox DNA (teal), the C-terminal HTH DNA-binding domain (blue, residues 188-276), and the fatty-acid pocket (orange) with the native ligand (yellow, from 3GBG superposition) ~30 A away (red dashes) - supporting an allosteric mechanism. ToxT fold high-confidence (pTM 0.85); DNA pose low-confidence (ipTM 0.31), interpreted only at the domain level."/>
+            <wp:docPr id="1" name="Figure 10. Ligand-pocket distance over 50 ns for cognate fatty acids, the native ligand, and the glucose decoy from two starting poses. Cognate lipids and the native ligand occupy the core (green band). The decoy from its docked (peripheral) pose stays at the pocket mouth (~9 A); when seeded in the core it is retained (~2.5 A), reflecting kinetic trapping in a buried cavity rather than binding preference. Specificity is established by binding preference (blind docking, Table 6; MM-GBSA), not by MD retention." descr="Figure 10. Ligand-pocket distance over 50 ns for cognate fatty acids, the native ligand, and the glucose decoy from two starting poses. Cognate lipids and the native ligand occupy the core (green band). The decoy from its docked (peripheral) pose stays at the pocket mouth (~9 A); when seeded in the core it is retained (~2.5 A), reflecting kinetic trapping in a buried cavity rather than binding preference. Specificity is established by binding preference (blind docking, Table 6; MM-GBSA), not by MD retention." title="Figure 10. Ligand-pocket distance over 50 ns for cognate fatty acids, the native ligand, and the glucose decoy from two starting poses. Cognate lipids and the native ligand occupy the core (green band). The decoy from its docked (peripheral) pose stays at the pocket mouth (~9 A); when seeded in the core it is retained (~2.5 A), reflecting kinetic trapping in a buried cavity rather than binding preference. Specificity is established by binding preference (blind docking, Table 6; MM-GBSA), not by MD retention."/>
             <wp:cNvGraphicFramePr>
               <a:graphicFrameLocks xmlns:a="http://schemas.openxmlformats.org/drawingml/2006/main" noChangeAspect="1"/>
             </wp:cNvGraphicFramePr>
@@ -9316,6 +9933,572 @@
                   <pic:spPr bwMode="auto">
                     <a:xfrm>
                       <a:off x="0" y="0"/>
+                      <a:ext cx="5715000" cy="3305175"/>
+                    </a:xfrm>
+                    <a:prstGeom prst="rect">
+                      <a:avLst/>
+                    </a:prstGeom>
+                  </pic:spPr>
+                </pic:pic>
+              </a:graphicData>
+            </a:graphic>
+          </wp:inline>
+        </w:drawing>
+      </w:r>
+    </w:p>
+    <w:p>
+      <w:pPr>
+        <w:spacing w:after="200"/>
+        <w:jc w:val="center"/>
+      </w:pPr>
+      <w:r>
+        <w:rPr>
+          <w:i/>
+          <w:iCs/>
+          <w:sz w:val="18"/>
+          <w:szCs w:val="18"/>
+        </w:rPr>
+        <w:t xml:space="preserve">Figure 10. Ligand-pocket distance over 50 ns for cognate fatty acids, the native ligand, and the glucose decoy from two starting poses. Cognate lipids and the native ligand occupy the core (green band). The decoy from its docked (peripheral) pose stays at the pocket mouth (~9 A); when seeded in the core it is retained (~2.5 A), reflecting kinetic trapping in a buried cavity rather than binding preference. Specificity is established by binding preference (blind docking, Table 6; MM-GBSA), not by MD retention.</w:t>
+      </w:r>
+    </w:p>
+    <w:p>
+      <w:pPr>
+        <w:pStyle w:val="Heading2"/>
+      </w:pPr>
+      <w:r>
+        <w:t xml:space="preserve">3.11 Comparison with known ToxT ligands</w:t>
+      </w:r>
+    </w:p>
+    <w:p>
+      <w:pPr>
+        <w:spacing w:after="120" w:line="276"/>
+        <w:jc w:val="both"/>
+      </w:pPr>
+      <w:r>
+        <w:t xml:space="preserve">Prior computational studies of ToxT ligands used heterogeneous programs and score units (e.g. GOLD fitness scores; MM interaction energies in kJ/mol) that are not directly comparable across methods. To place the algal lipids on a single comparable footing, three reference ToxT ligands were docked under the identical protocol (same box, seed and Vina 1.2.7 scoring): the engineered inhibitor virstatin, the short-chain fatty acid butyrate (a recently reported natural ToxT-targeting compound), and oleic acid (a native-type unsaturated fatty acid). The algal lipids (-6.8 to -8.8 kcal/mol) bound comparably to oleic acid (-7.90) and substantially more strongly than butyrate (-3.71). The purpose-designed inhibitor virstatin scored highest (-10.21), as expected for an engineered scaffold - a value that also partly reflects the docking score's known dependence on aromatic surface area, and virstatin's mechanism (interference with ToxT dimerisation) differs from direct pocket occupancy. Thus these microalgae supply naturally occurring ToxT-pocket binders that engage the site as effectively as its native regulator, without any medicinal-chemistry optimisation (Table 8).</w:t>
+      </w:r>
+    </w:p>
+    <w:p>
+      <w:pPr>
+        <w:spacing w:after="120" w:line="276"/>
+      </w:pPr>
+      <w:r>
+        <w:rPr>
+          <w:b/>
+          <w:bCs/>
+          <w:sz w:val="19"/>
+          <w:szCs w:val="19"/>
+        </w:rPr>
+        <w:t xml:space="preserve">Table 8. Reference ToxT ligands docked under the identical protocol.</w:t>
+      </w:r>
+    </w:p>
+    <w:tbl>
+      <w:tblPr>
+        <w:tblW w:type="dxa" w:w="9360"/>
+        <w:tblBorders>
+          <w:top w:val="single" w:color="auto" w:sz="4"/>
+          <w:left w:val="single" w:color="auto" w:sz="4"/>
+          <w:bottom w:val="single" w:color="auto" w:sz="4"/>
+          <w:right w:val="single" w:color="auto" w:sz="4"/>
+          <w:insideH w:val="single" w:color="auto" w:sz="4"/>
+          <w:insideV w:val="single" w:color="auto" w:sz="4"/>
+        </w:tblBorders>
+      </w:tblPr>
+      <w:tblGrid>
+        <w:gridCol w:w="3060"/>
+        <w:gridCol w:w="2400"/>
+        <w:gridCol w:w="3900"/>
+      </w:tblGrid>
+      <w:tr>
+        <w:trPr>
+          <w:tblHeader/>
+        </w:trPr>
+        <w:tc>
+          <w:tcPr>
+            <w:tcW w:type="dxa" w:w="3060"/>
+            <w:tcBorders>
+              <w:top w:val="single" w:color="BBBBBB" w:sz="1"/>
+              <w:left w:val="single" w:color="BBBBBB" w:sz="1"/>
+              <w:bottom w:val="single" w:color="BBBBBB" w:sz="1"/>
+              <w:right w:val="single" w:color="BBBBBB" w:sz="1"/>
+            </w:tcBorders>
+            <w:shd w:fill="1F4E79" w:val="clear"/>
+            <w:tcMar>
+              <w:top w:type="dxa" w:w="60"/>
+              <w:left w:type="dxa" w:w="100"/>
+              <w:bottom w:type="dxa" w:w="60"/>
+              <w:right w:type="dxa" w:w="100"/>
+            </w:tcMar>
+          </w:tcPr>
+          <w:p>
+            <w:r>
+              <w:rPr>
+                <w:b/>
+                <w:bCs/>
+                <w:color w:val="FFFFFF"/>
+                <w:sz w:val="19"/>
+                <w:szCs w:val="19"/>
+              </w:rPr>
+              <w:t xml:space="preserve">Compound</w:t>
+            </w:r>
+          </w:p>
+        </w:tc>
+        <w:tc>
+          <w:tcPr>
+            <w:tcW w:type="dxa" w:w="2400"/>
+            <w:tcBorders>
+              <w:top w:val="single" w:color="BBBBBB" w:sz="1"/>
+              <w:left w:val="single" w:color="BBBBBB" w:sz="1"/>
+              <w:bottom w:val="single" w:color="BBBBBB" w:sz="1"/>
+              <w:right w:val="single" w:color="BBBBBB" w:sz="1"/>
+            </w:tcBorders>
+            <w:shd w:fill="1F4E79" w:val="clear"/>
+            <w:tcMar>
+              <w:top w:type="dxa" w:w="60"/>
+              <w:left w:type="dxa" w:w="100"/>
+              <w:bottom w:type="dxa" w:w="60"/>
+              <w:right w:type="dxa" w:w="100"/>
+            </w:tcMar>
+          </w:tcPr>
+          <w:p>
+            <w:r>
+              <w:rPr>
+                <w:b/>
+                <w:bCs/>
+                <w:color w:val="FFFFFF"/>
+                <w:sz w:val="19"/>
+                <w:szCs w:val="19"/>
+              </w:rPr>
+              <w:t xml:space="preserve">dG (kcal/mol)</w:t>
+            </w:r>
+          </w:p>
+        </w:tc>
+        <w:tc>
+          <w:tcPr>
+            <w:tcW w:type="dxa" w:w="3900"/>
+            <w:tcBorders>
+              <w:top w:val="single" w:color="BBBBBB" w:sz="1"/>
+              <w:left w:val="single" w:color="BBBBBB" w:sz="1"/>
+              <w:bottom w:val="single" w:color="BBBBBB" w:sz="1"/>
+              <w:right w:val="single" w:color="BBBBBB" w:sz="1"/>
+            </w:tcBorders>
+            <w:shd w:fill="1F4E79" w:val="clear"/>
+            <w:tcMar>
+              <w:top w:type="dxa" w:w="60"/>
+              <w:left w:type="dxa" w:w="100"/>
+              <w:bottom w:type="dxa" w:w="60"/>
+              <w:right w:type="dxa" w:w="100"/>
+            </w:tcMar>
+          </w:tcPr>
+          <w:p>
+            <w:r>
+              <w:rPr>
+                <w:b/>
+                <w:bCs/>
+                <w:color w:val="FFFFFF"/>
+                <w:sz w:val="19"/>
+                <w:szCs w:val="19"/>
+              </w:rPr>
+              <w:t xml:space="preserve">Type</w:t>
+            </w:r>
+          </w:p>
+        </w:tc>
+      </w:tr>
+      <w:tr>
+        <w:tc>
+          <w:tcPr>
+            <w:tcW w:type="dxa" w:w="3060"/>
+            <w:tcBorders>
+              <w:top w:val="single" w:color="BBBBBB" w:sz="1"/>
+              <w:left w:val="single" w:color="BBBBBB" w:sz="1"/>
+              <w:bottom w:val="single" w:color="BBBBBB" w:sz="1"/>
+              <w:right w:val="single" w:color="BBBBBB" w:sz="1"/>
+            </w:tcBorders>
+            <w:tcMar>
+              <w:top w:type="dxa" w:w="60"/>
+              <w:left w:type="dxa" w:w="100"/>
+              <w:bottom w:type="dxa" w:w="60"/>
+              <w:right w:type="dxa" w:w="100"/>
+            </w:tcMar>
+          </w:tcPr>
+          <w:p>
+            <w:r>
+              <w:rPr>
+                <w:b w:val="false"/>
+                <w:bCs w:val="false"/>
+                <w:sz w:val="19"/>
+                <w:szCs w:val="19"/>
+              </w:rPr>
+              <w:t xml:space="preserve">virstatin</w:t>
+            </w:r>
+          </w:p>
+        </w:tc>
+        <w:tc>
+          <w:tcPr>
+            <w:tcW w:type="dxa" w:w="2400"/>
+            <w:tcBorders>
+              <w:top w:val="single" w:color="BBBBBB" w:sz="1"/>
+              <w:left w:val="single" w:color="BBBBBB" w:sz="1"/>
+              <w:bottom w:val="single" w:color="BBBBBB" w:sz="1"/>
+              <w:right w:val="single" w:color="BBBBBB" w:sz="1"/>
+            </w:tcBorders>
+            <w:tcMar>
+              <w:top w:type="dxa" w:w="60"/>
+              <w:left w:type="dxa" w:w="100"/>
+              <w:bottom w:type="dxa" w:w="60"/>
+              <w:right w:type="dxa" w:w="100"/>
+            </w:tcMar>
+          </w:tcPr>
+          <w:p>
+            <w:r>
+              <w:rPr>
+                <w:b w:val="false"/>
+                <w:bCs w:val="false"/>
+                <w:sz w:val="19"/>
+                <w:szCs w:val="19"/>
+              </w:rPr>
+              <w:t xml:space="preserve">-10.21</w:t>
+            </w:r>
+          </w:p>
+        </w:tc>
+        <w:tc>
+          <w:tcPr>
+            <w:tcW w:type="dxa" w:w="3900"/>
+            <w:tcBorders>
+              <w:top w:val="single" w:color="BBBBBB" w:sz="1"/>
+              <w:left w:val="single" w:color="BBBBBB" w:sz="1"/>
+              <w:bottom w:val="single" w:color="BBBBBB" w:sz="1"/>
+              <w:right w:val="single" w:color="BBBBBB" w:sz="1"/>
+            </w:tcBorders>
+            <w:tcMar>
+              <w:top w:type="dxa" w:w="60"/>
+              <w:left w:type="dxa" w:w="100"/>
+              <w:bottom w:type="dxa" w:w="60"/>
+              <w:right w:type="dxa" w:w="100"/>
+            </w:tcMar>
+          </w:tcPr>
+          <w:p>
+            <w:r>
+              <w:rPr>
+                <w:b w:val="false"/>
+                <w:bCs w:val="false"/>
+                <w:sz w:val="19"/>
+                <w:szCs w:val="19"/>
+              </w:rPr>
+              <w:t xml:space="preserve">synthetic, engineered inhibitor</w:t>
+            </w:r>
+          </w:p>
+        </w:tc>
+      </w:tr>
+      <w:tr>
+        <w:tc>
+          <w:tcPr>
+            <w:tcW w:type="dxa" w:w="3060"/>
+            <w:tcBorders>
+              <w:top w:val="single" w:color="BBBBBB" w:sz="1"/>
+              <w:left w:val="single" w:color="BBBBBB" w:sz="1"/>
+              <w:bottom w:val="single" w:color="BBBBBB" w:sz="1"/>
+              <w:right w:val="single" w:color="BBBBBB" w:sz="1"/>
+            </w:tcBorders>
+            <w:tcMar>
+              <w:top w:type="dxa" w:w="60"/>
+              <w:left w:type="dxa" w:w="100"/>
+              <w:bottom w:type="dxa" w:w="60"/>
+              <w:right w:type="dxa" w:w="100"/>
+            </w:tcMar>
+          </w:tcPr>
+          <w:p>
+            <w:r>
+              <w:rPr>
+                <w:b w:val="false"/>
+                <w:bCs w:val="false"/>
+                <w:sz w:val="19"/>
+                <w:szCs w:val="19"/>
+              </w:rPr>
+              <w:t xml:space="preserve">algal lipids (this study)</w:t>
+            </w:r>
+          </w:p>
+        </w:tc>
+        <w:tc>
+          <w:tcPr>
+            <w:tcW w:type="dxa" w:w="2400"/>
+            <w:tcBorders>
+              <w:top w:val="single" w:color="BBBBBB" w:sz="1"/>
+              <w:left w:val="single" w:color="BBBBBB" w:sz="1"/>
+              <w:bottom w:val="single" w:color="BBBBBB" w:sz="1"/>
+              <w:right w:val="single" w:color="BBBBBB" w:sz="1"/>
+            </w:tcBorders>
+            <w:tcMar>
+              <w:top w:type="dxa" w:w="60"/>
+              <w:left w:type="dxa" w:w="100"/>
+              <w:bottom w:type="dxa" w:w="60"/>
+              <w:right w:type="dxa" w:w="100"/>
+            </w:tcMar>
+          </w:tcPr>
+          <w:p>
+            <w:r>
+              <w:rPr>
+                <w:b w:val="false"/>
+                <w:bCs w:val="false"/>
+                <w:sz w:val="19"/>
+                <w:szCs w:val="19"/>
+              </w:rPr>
+              <w:t xml:space="preserve">-6.8 to -8.8</w:t>
+            </w:r>
+          </w:p>
+        </w:tc>
+        <w:tc>
+          <w:tcPr>
+            <w:tcW w:type="dxa" w:w="3900"/>
+            <w:tcBorders>
+              <w:top w:val="single" w:color="BBBBBB" w:sz="1"/>
+              <w:left w:val="single" w:color="BBBBBB" w:sz="1"/>
+              <w:bottom w:val="single" w:color="BBBBBB" w:sz="1"/>
+              <w:right w:val="single" w:color="BBBBBB" w:sz="1"/>
+            </w:tcBorders>
+            <w:tcMar>
+              <w:top w:type="dxa" w:w="60"/>
+              <w:left w:type="dxa" w:w="100"/>
+              <w:bottom w:type="dxa" w:w="60"/>
+              <w:right w:type="dxa" w:w="100"/>
+            </w:tcMar>
+          </w:tcPr>
+          <w:p>
+            <w:r>
+              <w:rPr>
+                <w:b w:val="false"/>
+                <w:bCs w:val="false"/>
+                <w:sz w:val="19"/>
+                <w:szCs w:val="19"/>
+              </w:rPr>
+              <w:t xml:space="preserve">natural (microalgal)</w:t>
+            </w:r>
+          </w:p>
+        </w:tc>
+      </w:tr>
+      <w:tr>
+        <w:tc>
+          <w:tcPr>
+            <w:tcW w:type="dxa" w:w="3060"/>
+            <w:tcBorders>
+              <w:top w:val="single" w:color="BBBBBB" w:sz="1"/>
+              <w:left w:val="single" w:color="BBBBBB" w:sz="1"/>
+              <w:bottom w:val="single" w:color="BBBBBB" w:sz="1"/>
+              <w:right w:val="single" w:color="BBBBBB" w:sz="1"/>
+            </w:tcBorders>
+            <w:tcMar>
+              <w:top w:type="dxa" w:w="60"/>
+              <w:left w:type="dxa" w:w="100"/>
+              <w:bottom w:type="dxa" w:w="60"/>
+              <w:right w:type="dxa" w:w="100"/>
+            </w:tcMar>
+          </w:tcPr>
+          <w:p>
+            <w:r>
+              <w:rPr>
+                <w:b w:val="false"/>
+                <w:bCs w:val="false"/>
+                <w:sz w:val="19"/>
+                <w:szCs w:val="19"/>
+              </w:rPr>
+              <w:t xml:space="preserve">oleic acid</w:t>
+            </w:r>
+          </w:p>
+        </w:tc>
+        <w:tc>
+          <w:tcPr>
+            <w:tcW w:type="dxa" w:w="2400"/>
+            <w:tcBorders>
+              <w:top w:val="single" w:color="BBBBBB" w:sz="1"/>
+              <w:left w:val="single" w:color="BBBBBB" w:sz="1"/>
+              <w:bottom w:val="single" w:color="BBBBBB" w:sz="1"/>
+              <w:right w:val="single" w:color="BBBBBB" w:sz="1"/>
+            </w:tcBorders>
+            <w:tcMar>
+              <w:top w:type="dxa" w:w="60"/>
+              <w:left w:type="dxa" w:w="100"/>
+              <w:bottom w:type="dxa" w:w="60"/>
+              <w:right w:type="dxa" w:w="100"/>
+            </w:tcMar>
+          </w:tcPr>
+          <w:p>
+            <w:r>
+              <w:rPr>
+                <w:b w:val="false"/>
+                <w:bCs w:val="false"/>
+                <w:sz w:val="19"/>
+                <w:szCs w:val="19"/>
+              </w:rPr>
+              <w:t xml:space="preserve">-7.90</w:t>
+            </w:r>
+          </w:p>
+        </w:tc>
+        <w:tc>
+          <w:tcPr>
+            <w:tcW w:type="dxa" w:w="3900"/>
+            <w:tcBorders>
+              <w:top w:val="single" w:color="BBBBBB" w:sz="1"/>
+              <w:left w:val="single" w:color="BBBBBB" w:sz="1"/>
+              <w:bottom w:val="single" w:color="BBBBBB" w:sz="1"/>
+              <w:right w:val="single" w:color="BBBBBB" w:sz="1"/>
+            </w:tcBorders>
+            <w:tcMar>
+              <w:top w:type="dxa" w:w="60"/>
+              <w:left w:type="dxa" w:w="100"/>
+              <w:bottom w:type="dxa" w:w="60"/>
+              <w:right w:type="dxa" w:w="100"/>
+            </w:tcMar>
+          </w:tcPr>
+          <w:p>
+            <w:r>
+              <w:rPr>
+                <w:b w:val="false"/>
+                <w:bCs w:val="false"/>
+                <w:sz w:val="19"/>
+                <w:szCs w:val="19"/>
+              </w:rPr>
+              <w:t xml:space="preserve">native-type unsaturated fatty acid</w:t>
+            </w:r>
+          </w:p>
+        </w:tc>
+      </w:tr>
+      <w:tr>
+        <w:tc>
+          <w:tcPr>
+            <w:tcW w:type="dxa" w:w="3060"/>
+            <w:tcBorders>
+              <w:top w:val="single" w:color="BBBBBB" w:sz="1"/>
+              <w:left w:val="single" w:color="BBBBBB" w:sz="1"/>
+              <w:bottom w:val="single" w:color="BBBBBB" w:sz="1"/>
+              <w:right w:val="single" w:color="BBBBBB" w:sz="1"/>
+            </w:tcBorders>
+            <w:tcMar>
+              <w:top w:type="dxa" w:w="60"/>
+              <w:left w:type="dxa" w:w="100"/>
+              <w:bottom w:type="dxa" w:w="60"/>
+              <w:right w:type="dxa" w:w="100"/>
+            </w:tcMar>
+          </w:tcPr>
+          <w:p>
+            <w:r>
+              <w:rPr>
+                <w:b w:val="false"/>
+                <w:bCs w:val="false"/>
+                <w:sz w:val="19"/>
+                <w:szCs w:val="19"/>
+              </w:rPr>
+              <w:t xml:space="preserve">butyric acid</w:t>
+            </w:r>
+          </w:p>
+        </w:tc>
+        <w:tc>
+          <w:tcPr>
+            <w:tcW w:type="dxa" w:w="2400"/>
+            <w:tcBorders>
+              <w:top w:val="single" w:color="BBBBBB" w:sz="1"/>
+              <w:left w:val="single" w:color="BBBBBB" w:sz="1"/>
+              <w:bottom w:val="single" w:color="BBBBBB" w:sz="1"/>
+              <w:right w:val="single" w:color="BBBBBB" w:sz="1"/>
+            </w:tcBorders>
+            <w:tcMar>
+              <w:top w:type="dxa" w:w="60"/>
+              <w:left w:type="dxa" w:w="100"/>
+              <w:bottom w:type="dxa" w:w="60"/>
+              <w:right w:type="dxa" w:w="100"/>
+            </w:tcMar>
+          </w:tcPr>
+          <w:p>
+            <w:r>
+              <w:rPr>
+                <w:b w:val="false"/>
+                <w:bCs w:val="false"/>
+                <w:sz w:val="19"/>
+                <w:szCs w:val="19"/>
+              </w:rPr>
+              <w:t xml:space="preserve">-3.71</w:t>
+            </w:r>
+          </w:p>
+        </w:tc>
+        <w:tc>
+          <w:tcPr>
+            <w:tcW w:type="dxa" w:w="3900"/>
+            <w:tcBorders>
+              <w:top w:val="single" w:color="BBBBBB" w:sz="1"/>
+              <w:left w:val="single" w:color="BBBBBB" w:sz="1"/>
+              <w:bottom w:val="single" w:color="BBBBBB" w:sz="1"/>
+              <w:right w:val="single" w:color="BBBBBB" w:sz="1"/>
+            </w:tcBorders>
+            <w:tcMar>
+              <w:top w:type="dxa" w:w="60"/>
+              <w:left w:type="dxa" w:w="100"/>
+              <w:bottom w:type="dxa" w:w="60"/>
+              <w:right w:type="dxa" w:w="100"/>
+            </w:tcMar>
+          </w:tcPr>
+          <w:p>
+            <w:r>
+              <w:rPr>
+                <w:b w:val="false"/>
+                <w:bCs w:val="false"/>
+                <w:sz w:val="19"/>
+                <w:szCs w:val="19"/>
+              </w:rPr>
+              <w:t xml:space="preserve">natural short-chain fatty acid</w:t>
+            </w:r>
+          </w:p>
+        </w:tc>
+      </w:tr>
+    </w:tbl>
+    <w:p>
+      <w:pPr>
+        <w:pStyle w:val="Heading2"/>
+      </w:pPr>
+      <w:r>
+        <w:t xml:space="preserve">3.12 A modelled ToxT-DNA complex indicates an allosteric mechanism</w:t>
+      </w:r>
+    </w:p>
+    <w:p>
+      <w:pPr>
+        <w:spacing w:after="120" w:line="276"/>
+        <w:jc w:val="both"/>
+      </w:pPr>
+      <w:r>
+        <w:t xml:space="preserve">To probe how fatty-acid binding translates into loss of virulence-gene activation, a ToxT-DNA complex was modelled with AlphaFold3 (full-length ToxT plus a 34-bp duplex bearing two direct-repeat toxbox elements). The ToxT fold was predicted with high confidence (pTM 0.85), whereas the protein-DNA interface was of modest confidence (ipTM 0.31); the model is therefore interpreted only at the domain level. The DNA was contacted exclusively by the C-terminal AraC-family helix-turn-helix domain (residues 188-276; e.g. Arg214, Lys235/237, Tyr250, Lys256), while the fatty-acid pocket lies on the separate N-terminal domain, making no direct contact with the DNA in the model (Figure 11). Because the regulatory pocket and the DNA-reading head are on distinct domains, fatty-acid occupancy is unlikely to sterically block DNA binding; the architecture is instead consistent with an allosteric mechanism in which pocket occupancy restrains the inter-domain conformation required for productive DNA engagement - the closed-state model of Lowden et al. (2010). The algal lipids are thus predicted to switch off ToxT-dependent transcription by locking ToxT in a DNA-binding-incompetent conformation rather than by competing with DNA directly. We emphasise that the ToxT-DNA model has a low-confidence interface (ipTM 0.31) and used a consensus toxbox, so this mechanism is a structural hypothesis, not an established geometry.</w:t>
+      </w:r>
+    </w:p>
+    <w:p>
+      <w:pPr>
+        <w:spacing w:after="60" w:before="120"/>
+        <w:jc w:val="center"/>
+      </w:pPr>
+      <w:r>
+        <w:drawing>
+          <wp:inline distT="0" distB="0" distL="0" distR="0">
+            <wp:extent cx="5715000" cy="4210050"/>
+            <wp:effectExtent t="0" r="0" b="0" l="0"/>
+            <wp:docPr id="1" name="Figure 11. AlphaFold3 model of the ToxT-DNA complex: toxbox DNA (teal), the C-terminal HTH DNA-binding domain (blue, residues 188-276), and the fatty-acid pocket (orange) with the native ligand (yellow, from 3GBG superposition) on the separate N-terminal domain (red dashes) - supporting an allosteric mechanism. ToxT fold high-confidence (pTM 0.85); DNA pose low-confidence (ipTM 0.31), interpreted only at the domain level, not as a precise geometry." descr="Figure 11. AlphaFold3 model of the ToxT-DNA complex: toxbox DNA (teal), the C-terminal HTH DNA-binding domain (blue, residues 188-276), and the fatty-acid pocket (orange) with the native ligand (yellow, from 3GBG superposition) on the separate N-terminal domain (red dashes) - supporting an allosteric mechanism. ToxT fold high-confidence (pTM 0.85); DNA pose low-confidence (ipTM 0.31), interpreted only at the domain level, not as a precise geometry." title="Figure 11. AlphaFold3 model of the ToxT-DNA complex: toxbox DNA (teal), the C-terminal HTH DNA-binding domain (blue, residues 188-276), and the fatty-acid pocket (orange) with the native ligand (yellow, from 3GBG superposition) on the separate N-terminal domain (red dashes) - supporting an allosteric mechanism. ToxT fold high-confidence (pTM 0.85); DNA pose low-confidence (ipTM 0.31), interpreted only at the domain level, not as a precise geometry."/>
+            <wp:cNvGraphicFramePr>
+              <a:graphicFrameLocks xmlns:a="http://schemas.openxmlformats.org/drawingml/2006/main" noChangeAspect="1"/>
+            </wp:cNvGraphicFramePr>
+            <a:graphic xmlns:a="http://schemas.openxmlformats.org/drawingml/2006/main">
+              <a:graphicData uri="http://schemas.openxmlformats.org/drawingml/2006/picture">
+                <pic:pic xmlns:pic="http://schemas.openxmlformats.org/drawingml/2006/picture">
+                  <pic:nvPicPr>
+                    <pic:cNvPr id="0" name="" descr=""/>
+                    <pic:cNvPicPr>
+                      <a:picLocks noChangeAspect="1" noChangeArrowheads="1"/>
+                    </pic:cNvPicPr>
+                  </pic:nvPicPr>
+                  <pic:blipFill>
+                    <a:blip r:embed="rId20" cstate="none"/>
+                    <a:srcRect/>
+                    <a:stretch>
+                      <a:fillRect/>
+                    </a:stretch>
+                  </pic:blipFill>
+                  <pic:spPr bwMode="auto">
+                    <a:xfrm>
+                      <a:off x="0" y="0"/>
                       <a:ext cx="5715000" cy="4210050"/>
                     </a:xfrm>
                     <a:prstGeom prst="rect">
@@ -9341,7 +10524,7 @@
           <w:sz w:val="18"/>
           <w:szCs w:val="18"/>
         </w:rPr>
-        <w:t xml:space="preserve">Figure 11. AlphaFold3 model of the ToxT-DNA complex: toxbox DNA (teal), the C-terminal HTH DNA-binding domain (blue, residues 188-276), and the fatty-acid pocket (orange) with the native ligand (yellow, from 3GBG superposition) ~30 A away (red dashes) - supporting an allosteric mechanism. ToxT fold high-confidence (pTM 0.85); DNA pose low-confidence (ipTM 0.31), interpreted only at the domain level.</w:t>
+        <w:t xml:space="preserve">Figure 11. AlphaFold3 model of the ToxT-DNA complex: toxbox DNA (teal), the C-terminal HTH DNA-binding domain (blue, residues 188-276), and the fatty-acid pocket (orange) with the native ligand (yellow, from 3GBG superposition) on the separate N-terminal domain (red dashes) - supporting an allosteric mechanism. ToxT fold high-confidence (pTM 0.85); DNA pose low-confidence (ipTM 0.31), interpreted only at the domain level, not as a precise geometry.</w:t>
       </w:r>
     </w:p>
     <w:p>
@@ -9358,7 +10541,7 @@
         <w:jc w:val="both"/>
       </w:pPr>
       <w:r>
-        <w:t xml:space="preserve">These results support direct engagement of algal lipids with the ToxT fatty-acid pocket as a plausible basis for their antivirulence activity. The protocol is validated (redocking 1.41 A), internally consistent across two scoring functions (rho = 0.83), and yields a clear structure-activity relationship: binding strength increases with acyl-chain unsaturation and length, mirroring the natural ToxT ligand and the Lowden mechanism in which cis double bonds impose the bent geometry that fits the pocket.</w:t>
+        <w:t xml:space="preserve">These results support direct engagement of algal lipids with the ToxT fatty-acid pocket as a plausible basis for their antivirulence activity. The protocol is validated (redocking 1.41 A), internally consistent across two scoring functions (rho = 0.83), and yields a clear structure-activity relationship: binding strength increases with acyl-chain unsaturation and length, mirroring the native unsaturated ToxT ligand. A same-length (C18) analysis clarifies the basis: rather than simply increasing overall contact (dominated by chain length), the cis double bonds position their pi-systems against the aromatic-cage residues (alkene-pi, 3.7-4.0 A; Section 3.4, Figure 12), a specific if modest rationale for the unsaturation preference.</w:t>
       </w:r>
     </w:p>
     <w:p>
@@ -9381,19 +10564,28 @@
     </w:p>
     <w:p>
       <w:pPr>
-        <w:pStyle w:val="Heading1"/>
-      </w:pPr>
-      <w:r>
-        <w:t xml:space="preserve">5. Limitations</w:t>
-      </w:r>
-    </w:p>
-    <w:p>
-      <w:pPr>
         <w:spacing w:after="120" w:line="276"/>
         <w:jc w:val="both"/>
       </w:pPr>
       <w:r>
-        <w:t xml:space="preserve">Docking provides relative hypotheses, not absolute affinities (Vina ~ +/-1-2 kcal/mol); within-tier rank differences should not be over-interpreted. Docking used a single rigid-receptor conformation; MD (top binder, both forms) confirmed the complex is stable, but induced-fit was not explored for the full panel, and MD was run as single 50 ns trajectories (replicates would strengthen statistics). MD covered 13 systems (three fatty acids x three forms, plus positive/negative controls and weak binders) as single 50 ns trajectories; independent replicates and MD of the remaining panel members would further strengthen the statistics. Organism-level interpretation requires quantitative GC-MS abundances, available here only qualitatively (presence/absence), so abundance-weighting remains future work.</w:t>
+        <w:t xml:space="preserve">Critically, this closes the loop with our experimental observations (Jaiswal et al., 2025). ToxT is the direct transcriptional activator of the ctxAB (cholera-toxin) promoter, so lipid occupancy of the ToxT pocket offers a concrete molecular explanation for the 93-97.9% suppression of CT production - with viability intact - that we measured for CV and CCM extracts in vitro and in the rabbit ileal-loop model. The greater in-vitro potency of CCM (97.9%) relative to CV, despite indistinguishable per-lipid docking affinities, is consistent with organism-level differences arising from extract composition/abundance rather than intrinsically stronger binders. The computational study thus supplies the missing mechanistic layer - a specific target and binding mode - beneath a previously phenomenological antivirulence observation.</w:t>
+      </w:r>
+    </w:p>
+    <w:p>
+      <w:pPr>
+        <w:pStyle w:val="Heading1"/>
+      </w:pPr>
+      <w:r>
+        <w:t xml:space="preserve">5. Limitations</w:t>
+      </w:r>
+    </w:p>
+    <w:p>
+      <w:pPr>
+        <w:spacing w:after="120" w:line="276"/>
+        <w:jc w:val="both"/>
+      </w:pPr>
+      <w:r>
+        <w:t xml:space="preserve">This study is entirely computational and provides a mechanistic rationale for antivirulence activity we reported experimentally elsewhere; it does not itself demonstrate ToxT inhibition, which requires direct assays (ToxT-DNA EMSA or a promoter-reporter). Panel affinities span only ~2 kcal/mol (within Vina error), so correlations describe trends, not per-lipid ranking, and the descriptors are collinear. Docking used one rigid conformation; each MD system was a single 50 ns trajectory, and because the pocket is internal, ligand retention is a modest bar rather than strong evidence of favourable binding (independent replicates are in progress; specificity rests on binding preference, not MD retention, as below). The glucose decoy was tested from both a peripheral docked pose and seeded in the pocket core; because it is retained when core-seeded, MD stability alone does not establish specificity for this internal pocket, so the specificity conclusion rests on binding preference (blind docking: 0/20 poses in the pocket; weak affinity) and MM-GBSA energetics. An apo-versus-holo comparison would further probe allosteric rigidification. Single-trajectory MM-GBSA (OBC, no entropy) gives relative energies and converged only for neutral/well-behaved systems; charged and some ester ligands were noisy and are reported cautiously. The AlphaFold3 ToxT-DNA model has a low-confidence interface and used a consensus toxbox. Organism-level interpretation requires quantitative GC-MS abundances, available here only qualitatively.</w:t>
       </w:r>
     </w:p>
     <w:p>
@@ -9459,7 +10651,7 @@
           <w:sz w:val="19"/>
           <w:szCs w:val="19"/>
         </w:rPr>
-        <w:t xml:space="preserve">2. Trott O, Olson AJ. AutoDock Vina: improving the speed and accuracy of docking. J Comput Chem 2010;31:455-461.</w:t>
+        <w:t xml:space="preserve">2. Withey JH, DiRita VJ. The toxbox: specific DNA sequence requirements for activation of V. cholerae virulence genes by ToxT. Mol Microbiol 2006;59:1779-1789.</w:t>
       </w:r>
     </w:p>
     <w:p>
@@ -9471,7 +10663,7 @@
           <w:sz w:val="19"/>
           <w:szCs w:val="19"/>
         </w:rPr>
-        <w:t xml:space="preserve">3. Eberhardt J, Santos-Martins D, Tillack AF, Forli S. AutoDock Vina 1.2.0. J Chem Inf Model 2021;61:3891-3898.</w:t>
+        <w:t xml:space="preserve">3. Hung DT, et al. Small-molecule inhibitor of V. cholerae virulence and intestinal colonization (virstatin). Science 2005;310:670-674.</w:t>
       </w:r>
     </w:p>
     <w:p>
@@ -9483,7 +10675,7 @@
           <w:sz w:val="19"/>
           <w:szCs w:val="19"/>
         </w:rPr>
-        <w:t xml:space="preserve">4. Quiroga R, Villarreal MA. Vinardo: A scoring function based on AutoDock Vina. PLoS ONE 2016;11:e0155183.</w:t>
+        <w:t xml:space="preserve">4. Woodbrey AK, et al. A modified ToxT inhibitor reduces V. cholerae virulence in vivo. Biochemistry 2018;57:5609-5615.</w:t>
       </w:r>
     </w:p>
     <w:p>
@@ -9495,7 +10687,7 @@
           <w:sz w:val="19"/>
           <w:szCs w:val="19"/>
         </w:rPr>
-        <w:t xml:space="preserve">5. Kim S, et al. PubChem 2023 update. Nucleic Acids Res 2023;51:D1373-D1380.</w:t>
+        <w:t xml:space="preserve">5. Anthouard R, DiRita VJ. Small-molecule inhibitors of toxT expression in V. cholerae (toxtazins). mBio 2013;4:e00403-13.</w:t>
       </w:r>
     </w:p>
     <w:p>
@@ -9507,7 +10699,175 @@
           <w:sz w:val="19"/>
           <w:szCs w:val="19"/>
         </w:rPr>
-        <w:t xml:space="preserve">6. Landrum G, et al. RDKit: Open-source cheminformatics. https://www.rdkit.org.</w:t>
+        <w:t xml:space="preserve">6. [Structure-based fatty-acid-mimetic ToxT inhibitors]. Sci Rep 2017;7:45011.</w:t>
+      </w:r>
+    </w:p>
+    <w:p>
+      <w:pPr>
+        <w:spacing w:after="80"/>
+      </w:pPr>
+      <w:r>
+        <w:rPr>
+          <w:sz w:val="19"/>
+          <w:szCs w:val="19"/>
+        </w:rPr>
+        <w:t xml:space="preserve">7. [Herbal in-silico screen against ToxT: luteolin, catechin] 2016.</w:t>
+      </w:r>
+    </w:p>
+    <w:p>
+      <w:pPr>
+        <w:spacing w:after="80"/>
+      </w:pPr>
+      <w:r>
+        <w:rPr>
+          <w:sz w:val="19"/>
+          <w:szCs w:val="19"/>
+        </w:rPr>
+        <w:t xml:space="preserve">8. [Sodium butyrate targeting ToxT]. mSphere 2024.</w:t>
+      </w:r>
+    </w:p>
+    <w:p>
+      <w:pPr>
+        <w:spacing w:after="80"/>
+      </w:pPr>
+      <w:r>
+        <w:rPr>
+          <w:sz w:val="19"/>
+          <w:szCs w:val="19"/>
+        </w:rPr>
+        <w:t xml:space="preserve">9. Jaiswal S, Vadadoriya N, Nasir A, Dineshkumar R, Khatri N, Raut S, Ray Chaudhuri S, Chatterjee S, Haldar S. Exploring microalgal lipids as anti-virulent agents targeting MDR Vibrio cholerae infection: a step toward developing herbal ORS formulations. J Nat Prod Discov 2025;4(2):3244. doi:10.24377/jnpd.article3244. (our prior experimental study)</w:t>
+      </w:r>
+    </w:p>
+    <w:p>
+      <w:pPr>
+        <w:spacing w:after="80"/>
+      </w:pPr>
+      <w:r>
+        <w:rPr>
+          <w:sz w:val="19"/>
+          <w:szCs w:val="19"/>
+        </w:rPr>
+        <w:t xml:space="preserve">10. Trott O, Olson AJ. AutoDock Vina. J Comput Chem 2010;31:455-461.</w:t>
+      </w:r>
+    </w:p>
+    <w:p>
+      <w:pPr>
+        <w:spacing w:after="80"/>
+      </w:pPr>
+      <w:r>
+        <w:rPr>
+          <w:sz w:val="19"/>
+          <w:szCs w:val="19"/>
+        </w:rPr>
+        <w:t xml:space="preserve">11. Eberhardt J, Santos-Martins D, Tillack AF, Forli S. AutoDock Vina 1.2.0. J Chem Inf Model 2021;61:3891-3898.</w:t>
+      </w:r>
+    </w:p>
+    <w:p>
+      <w:pPr>
+        <w:spacing w:after="80"/>
+      </w:pPr>
+      <w:r>
+        <w:rPr>
+          <w:sz w:val="19"/>
+          <w:szCs w:val="19"/>
+        </w:rPr>
+        <w:t xml:space="preserve">12. Quiroga R, Villarreal MA. Vinardo scoring function. PLoS ONE 2016;11:e0155183.</w:t>
+      </w:r>
+    </w:p>
+    <w:p>
+      <w:pPr>
+        <w:spacing w:after="80"/>
+      </w:pPr>
+      <w:r>
+        <w:rPr>
+          <w:sz w:val="19"/>
+          <w:szCs w:val="19"/>
+        </w:rPr>
+        <w:t xml:space="preserve">13. Eastman P, et al. OpenMM 8. J Phys Chem B 2024;128:109-116.</w:t>
+      </w:r>
+    </w:p>
+    <w:p>
+      <w:pPr>
+        <w:spacing w:after="80"/>
+      </w:pPr>
+      <w:r>
+        <w:rPr>
+          <w:sz w:val="19"/>
+          <w:szCs w:val="19"/>
+        </w:rPr>
+        <w:t xml:space="preserve">14. Boothroyd S, et al. Open Force Field 2.0.0 (Sage). J Chem Theory Comput 2023;19:3251-3275.</w:t>
+      </w:r>
+    </w:p>
+    <w:p>
+      <w:pPr>
+        <w:spacing w:after="80"/>
+      </w:pPr>
+      <w:r>
+        <w:rPr>
+          <w:sz w:val="19"/>
+          <w:szCs w:val="19"/>
+        </w:rPr>
+        <w:t xml:space="preserve">15. OpenFF-NAGL: graph-neural-network partial charges (Open Force Field Initiative).</w:t>
+      </w:r>
+    </w:p>
+    <w:p>
+      <w:pPr>
+        <w:spacing w:after="80"/>
+      </w:pPr>
+      <w:r>
+        <w:rPr>
+          <w:sz w:val="19"/>
+          <w:szCs w:val="19"/>
+        </w:rPr>
+        <w:t xml:space="preserve">16. Abramson J, et al. Accurate structure prediction of biomolecular interactions with AlphaFold3. Nature 2024;630:493-500.</w:t>
+      </w:r>
+    </w:p>
+    <w:p>
+      <w:pPr>
+        <w:spacing w:after="80"/>
+      </w:pPr>
+      <w:r>
+        <w:rPr>
+          <w:sz w:val="19"/>
+          <w:szCs w:val="19"/>
+        </w:rPr>
+        <w:t xml:space="preserve">17. McGibbon RT, et al. MDTraj: analysis of molecular dynamics trajectories. Biophys J 2015;109:1528-1532.</w:t>
+      </w:r>
+    </w:p>
+    <w:p>
+      <w:pPr>
+        <w:spacing w:after="80"/>
+      </w:pPr>
+      <w:r>
+        <w:rPr>
+          <w:sz w:val="19"/>
+          <w:szCs w:val="19"/>
+        </w:rPr>
+        <w:t xml:space="preserve">18. Kim S, et al. PubChem 2023 update. Nucleic Acids Res 2023;51:D1373-D1380.</w:t>
+      </w:r>
+    </w:p>
+    <w:p>
+      <w:pPr>
+        <w:spacing w:after="80"/>
+      </w:pPr>
+      <w:r>
+        <w:rPr>
+          <w:sz w:val="19"/>
+          <w:szCs w:val="19"/>
+        </w:rPr>
+        <w:t xml:space="preserve">19. Landrum G, et al. RDKit: Open-source cheminformatics. https://www.rdkit.org.</w:t>
+      </w:r>
+    </w:p>
+    <w:p>
+      <w:pPr>
+        <w:spacing w:after="80"/>
+      </w:pPr>
+      <w:r>
+        <w:rPr>
+          <w:sz w:val="19"/>
+          <w:szCs w:val="19"/>
+        </w:rPr>
+        <w:t xml:space="preserve">20. (Bracketed entries: complete author lists/volumes to be filled during formatting.)</w:t>
       </w:r>
     </w:p>
     <w:sectPr>

</xml_diff>